<commit_message>
Revision 2 deliverables: manuscript, supplement, response, highlights (docx); release manifest for code commit 9d5a37b
Co-Authored-By: Claude Opus 5.5 <noreply@anthropic.com>
Claude-Session: https://claude.ai/code/session_01GFzJmQTFtMep2it1kYJtwA
</commit_message>
<xml_diff>
--- a/cassia/manuscript/CASSIA_manuscript.docx
+++ b/cassia/manuscript/CASSIA_manuscript.docx
@@ -12755,7 +12755,7 @@
           <w:b/>
           <w:bCs/>
         </w:rPr>
-        <w:t xml:space="preserve">The conclusions hold across mechanisms, but transfer between mechanisms is not free (Fig. 8a; Table S6).</w:t>
+        <w:t xml:space="preserve">The conclusions hold across mechanisms, but transfer between mechanisms is not free (Fig. 5a; Table S6).</w:t>
       </w:r>
       <w:r>
         <w:t xml:space="preserve"> RF with speciation features was evaluated on five corpora for each mechanism scenario:</w:t>
@@ -12841,7 +12841,10 @@
           <w:b/>
           <w:bCs/>
         </w:rPr>
-        <w:t xml:space="preserve">More studies help, more rows do not.</w:t>
+        <w:t xml:space="preserve">More studies help, more rows do not (Fig. 5b).</w:t>
+      </w:r>
+      <w:r>
+        <w:t xml:space="preserve"> The learning curve was repeated with 8 replicate corpora per size (v0.2 used 4, and its curve was not monotonic: 0.47, 0.59, 0.56, 0.75):</w:t>
       </w:r>
     </w:p>
     <w:p>
@@ -12854,7 +12857,7 @@
         <w:spacing w:line="480" w:lineRule="auto"/>
       </w:pPr>
       <w:r>
-        <w:t xml:space="preserve">LOSO R² rose from 0.47 ± 0.14 with 12 studies to 0.59 ± 0.14 (24), 0.56 ± 0.11 (48) and 0.75 ± 0.08 (96).</w:t>
+        <w:t xml:space="preserve">LOSO R² rose from 0.31 ± 0.09 (mean ± SE) with 12 studies to 0.58 ± 0.05 (24), 0.66 ± 0.02 (48) and 0.66 ± 0.02 (96). The rank correlation between corpus size and LOSO R² was ρ = 0.58 (p &lt; 0.001, 32 corpora).</w:t>
       </w:r>
     </w:p>
     <w:p>
@@ -12867,7 +12870,7 @@
         <w:spacing w:line="480" w:lineRule="auto"/>
       </w:pPr>
       <w:r>
-        <w:t xml:space="preserve">Random-split R² stayed between 0.80 and 0.90 throughout.</w:t>
+        <w:t xml:space="preserve">With 8 replicates the curve is monotonic in its means but levels off beyond about 48 studies. The 48- and 96-study means differ by less than their SE. The v0.2 dip at 48 studies and its higher value at 96 were therefore replicate noise.</w:t>
       </w:r>
     </w:p>
     <w:p>
@@ -12880,7 +12883,33 @@
         <w:spacing w:line="480" w:lineRule="auto"/>
       </w:pPr>
       <w:r>
-        <w:t xml:space="preserve">The effective sample size for transferability is the number of independent studies. On this evidence, a literature corpus of 20–30 studies yields LOSO R² of about 0.5–0.6.</w:t>
+        <w:t xml:space="preserve">The between-replicate SD fell from 0.26 (12 studies) to 0.06 (96). Small corpora are unreliable as well as less accurate.</w:t>
+      </w:r>
+    </w:p>
+    <w:p>
+      <w:pPr>
+        <w:pStyle w:val="ListParagraph"/>
+        <w:numPr>
+          <w:ilvl w:val="0"/>
+          <w:numId w:val="2"/>
+        </w:numPr>
+        <w:spacing w:line="480" w:lineRule="auto"/>
+      </w:pPr>
+      <w:r>
+        <w:t xml:space="preserve">Random-split R² stayed between 0.85 and 0.90 throughout.</w:t>
+      </w:r>
+    </w:p>
+    <w:p>
+      <w:pPr>
+        <w:pStyle w:val="ListParagraph"/>
+        <w:numPr>
+          <w:ilvl w:val="0"/>
+          <w:numId w:val="2"/>
+        </w:numPr>
+        <w:spacing w:line="480" w:lineRule="auto"/>
+      </w:pPr>
+      <w:r>
+        <w:t xml:space="preserve">The effective sample size for transferability is the number of independent studies. On this evidence, a literature corpus of 20–30 studies yields LOSO R² of about 0.5–0.6, and the plateau near 0.66 reflects irreducible between-study heterogeneity in the simulator, not a general property of real data.</w:t>
       </w:r>
     </w:p>
     <w:p>
@@ -14304,7 +14333,77 @@
           <w:sz w:val="22"/>
           <w:szCs w:val="22"/>
         </w:rPr>
-        <w:t xml:space="preserve"> Transferability of ML models (synthetic; 20 corpora of 30 studies). (a) R² for apparent Cr(VI) uptake under five validation schemes (bars: mean; whiskers: 2.5–97.5% range across corpora). (b) Learning curve: R² against the number of independent studies (RF with speciation features; mean ± SD of 4 replicates). (c) Per-study RMSE under leave-one-study-out by family (ACc/ACp: chemically/physically activated carbon; BCw/BCm: wood/manure biochar; HC: hydrochar; PC: biomass-derived porous carbon).</w:t>
+        <w:t xml:space="preserve"> Transferability of ML models (synthetic; 20 corpora of 30 studies). (a) R² for apparent Cr(VI) uptake under five validation schemes (bars: mean; whiskers: 2.5–97.5% range across corpora). (b) Learning curve from v0.2: R² against the number of independent studies (RF with speciation features; mean ± SD of 4 replicates); superseded by the 8-replicate curve in Fig. 5b. (c) Per-study RMSE under leave-one-study-out by family (ACc/ACp: chemically/physically activated carbon; BCw/BCm: wood/manure biochar; HC: hydrochar; PC: biomass-derived porous carbon).</w:t>
+      </w:r>
+    </w:p>
+    <w:p>
+      <w:pPr>
+        <w:keepNext/>
+        <w:spacing w:after="120" w:before="240" w:line="240" w:lineRule="auto"/>
+        <w:jc w:val="center"/>
+      </w:pPr>
+      <w:r>
+        <w:drawing>
+          <wp:inline distT="0" distB="0" distL="0" distR="0">
+            <wp:extent cx="5667375" cy="2238375"/>
+            <wp:effectExtent t="0" r="0" b="0" l="0"/>
+            <wp:docPr id="1" name="fig8_mechanism_transfer.png" descr="fig8_mechanism_transfer.png" title="fig8_mechanism_transfer.png"/>
+            <wp:cNvGraphicFramePr>
+              <a:graphicFrameLocks xmlns:a="http://schemas.openxmlformats.org/drawingml/2006/main" noChangeAspect="1"/>
+            </wp:cNvGraphicFramePr>
+            <a:graphic xmlns:a="http://schemas.openxmlformats.org/drawingml/2006/main">
+              <a:graphicData uri="http://schemas.openxmlformats.org/drawingml/2006/picture">
+                <pic:pic xmlns:pic="http://schemas.openxmlformats.org/drawingml/2006/picture">
+                  <pic:nvPicPr>
+                    <pic:cNvPr id="0" name="" descr=""/>
+                    <pic:cNvPicPr>
+                      <a:picLocks noChangeAspect="1" noChangeArrowheads="1"/>
+                    </pic:cNvPicPr>
+                  </pic:nvPicPr>
+                  <pic:blipFill>
+                    <a:blip r:embed="rId12" cstate="none"/>
+                    <a:srcRect/>
+                    <a:stretch>
+                      <a:fillRect/>
+                    </a:stretch>
+                  </pic:blipFill>
+                  <pic:spPr bwMode="auto">
+                    <a:xfrm>
+                      <a:off x="0" y="0"/>
+                      <a:ext cx="5667375" cy="2238375"/>
+                    </a:xfrm>
+                    <a:prstGeom prst="rect">
+                      <a:avLst/>
+                    </a:prstGeom>
+                  </pic:spPr>
+                </pic:pic>
+              </a:graphicData>
+            </a:graphic>
+          </wp:inline>
+        </w:drawing>
+      </w:r>
+    </w:p>
+    <w:p>
+      <w:pPr>
+        <w:keepNext w:val="false"/>
+        <w:spacing w:after="240" w:line="240" w:lineRule="auto"/>
+        <w:jc w:val="both"/>
+      </w:pPr>
+      <w:r>
+        <w:rPr>
+          <w:b/>
+          <w:bCs/>
+          <w:sz w:val="22"/>
+          <w:szCs w:val="22"/>
+        </w:rPr>
+        <w:t xml:space="preserve">Fig. 5.</w:t>
+      </w:r>
+      <w:r>
+        <w:rPr>
+          <w:sz w:val="22"/>
+          <w:szCs w:val="22"/>
+        </w:rPr>
+        <w:t xml:space="preserve"> Robustness of the ML and interval results across mechanisms (synthetic). (a) Out-of-fold R² for apparent uptake by mechanism scenario (RF with speciation features; 5 corpora per scenario; bars: mean, whiskers: SD): random 5-fold, leave-one-study-out, leave-one-family-out, and models trained on scenario-E corpora and tested on the given scenario. (b) Learning curve: leave-one-study-out R² against the number of studies (8 replicate corpora per size; mean ± SE; points: replicates) and random-split R². (c) Fraction of unseen studies with ≥ 90% within-study coverage at nominal 90%, by scenario and interval method (dotted: 0.90).</w:t>
       </w:r>
     </w:p>
     <w:p>
@@ -14334,7 +14433,7 @@
         <w:jc w:val="both"/>
       </w:pPr>
       <w:r>
-        <w:t xml:space="preserve">Table 6 and Fig. 5 report outer leave-one-study-out evaluations on 10 corpora: 300 test studies for Cr(VI) endpoints and 182 for total-Cr endpoints, which are measured only in Class A/B studies.</w:t>
+        <w:t xml:space="preserve">Table 6 and Fig. 6 report outer leave-one-study-out evaluations on 10 corpora: 300 test studies for Cr(VI) endpoints and 182 for total-Cr endpoints, which are measured only in Class A/B studies.</w:t>
       </w:r>
     </w:p>
     <w:p>
@@ -14517,7 +14616,7 @@
           <w:b/>
           <w:bCs/>
         </w:rPr>
-        <w:t xml:space="preserve">The exact split-conformal interval M2s behaved as its theorem predicts (Table 6b, Fig. 5).</w:t>
+        <w:t xml:space="preserve">The exact split-conformal interval M2s behaved as its theorem predicts (Table 6b, Fig. 6).</w:t>
       </w:r>
     </w:p>
     <w:p>
@@ -14597,7 +14696,7 @@
         <w:t xml:space="preserve">Across mechanisms.</w:t>
       </w:r>
       <w:r>
-        <w:t xml:space="preserve"> The guarantee held in all five scenarios (≥ 0.92 of studies covered at ≥ 90%; Fig. 8c).</w:t>
+        <w:t xml:space="preserve"> The guarantee held in all five scenarios (≥ 0.92 of studies covered at ≥ 90%; Fig. 5c).</w:t>
       </w:r>
     </w:p>
     <w:p>
@@ -19043,7 +19142,7 @@
                     </pic:cNvPicPr>
                   </pic:nvPicPr>
                   <pic:blipFill>
-                    <a:blip r:embed="rId12" cstate="none"/>
+                    <a:blip r:embed="rId13" cstate="none"/>
                     <a:srcRect/>
                     <a:stretch>
                       <a:fillRect/>
@@ -19078,7 +19177,7 @@
           <w:sz w:val="22"/>
           <w:szCs w:val="22"/>
         </w:rPr>
-        <w:t xml:space="preserve">Fig. 5.</w:t>
+        <w:t xml:space="preserve">Fig. 6.</w:t>
       </w:r>
       <w:r>
         <w:rPr>
@@ -19122,7 +19221,7 @@
         <w:t xml:space="preserve">Set-up.</w:t>
       </w:r>
       <w:r>
-        <w:t xml:space="preserve"> Of the 300 new materials per target (20 cohorts × 15), 169 (S1) and 181 (S2) could truly meet both limits somewhere on the design grid (Table 7, Fig. 6).</w:t>
+        <w:t xml:space="preserve"> Of the 300 new materials per target (20 cohorts × 15), 169 (S1) and 181 (S2) could truly meet both limits somewhere on the design grid (Table 7, Fig. 7).</w:t>
       </w:r>
     </w:p>
     <w:p>
@@ -19361,7 +19460,7 @@
           <w:b/>
           <w:bCs/>
         </w:rPr>
-        <w:t xml:space="preserve">Verification is a sequential decision, so its false-acceptance risk was evaluated explicitly (Table 7b, Fig. 6b,c).</w:t>
+        <w:t xml:space="preserve">Verification is a sequential decision, so its false-acceptance risk was evaluated explicitly (Table 7b, Fig. 7b,c).</w:t>
       </w:r>
     </w:p>
     <w:p>
@@ -23376,7 +23475,7 @@
                     </pic:cNvPicPr>
                   </pic:nvPicPr>
                   <pic:blipFill>
-                    <a:blip r:embed="rId13" cstate="none"/>
+                    <a:blip r:embed="rId14" cstate="none"/>
                     <a:srcRect/>
                     <a:stretch>
                       <a:fillRect/>
@@ -23411,14 +23510,14 @@
           <w:sz w:val="22"/>
           <w:szCs w:val="22"/>
         </w:rPr>
-        <w:t xml:space="preserve">Fig. 6.</w:t>
+        <w:t xml:space="preserve">Fig. 7.</w:t>
       </w:r>
       <w:r>
         <w:rPr>
           <w:sz w:val="22"/>
           <w:szCs w:val="22"/>
         </w:rPr>
-        <w:t xml:space="preserve"> Treatment design for new virtual materials (synthetic; 20 cohorts × 15 materials). (a) Fraction of recommended designs that comply in truth, with Wilson 95% intervals; numbers in the bars are median doses. (b) Predicted against true total Cr at the selected designs (S1). (c) Compliance of point + verification designs under perturbations of pH and dose (S1).</w:t>
+        <w:t xml:space="preserve"> Treatment design for new virtual materials (synthetic; 20 cohorts × 15 materials per target). (a) Fraction of all materials receiving an unsafe recommendation, and fraction of attainable materials for which a compliant design was found, by design rule (point prediction; marginal and joint 90% bounds; joint 90% and 80% bounds with up to four confirmatory batches; point prediction with sequential verification); solid: S1, hatched: S2. (b) Distribution over materials of the probability of accepting a non-compliant design under the two verification rules (shared calibration bias; materials whose dose ladder contains a non-compliant dose; dotted: 5%). (c) Mean probability of acceptance within four rounds; numbers in the bars: mean batches per material.</w:t>
       </w:r>
     </w:p>
     <w:p>
@@ -23599,7 +23698,7 @@
                     </pic:cNvPicPr>
                   </pic:nvPicPr>
                   <pic:blipFill>
-                    <a:blip r:embed="rId14" cstate="none"/>
+                    <a:blip r:embed="rId15" cstate="none"/>
                     <a:srcRect/>
                     <a:stretch>
                       <a:fillRect/>
@@ -23634,7 +23733,7 @@
           <w:sz w:val="22"/>
           <w:szCs w:val="22"/>
         </w:rPr>
-        <w:t xml:space="preserve">Fig. 7.</w:t>
+        <w:t xml:space="preserve">Fig. 8.</w:t>
       </w:r>
       <w:r>
         <w:rPr>
@@ -25106,7 +25205,7 @@
         <w:t xml:space="preserve">4.	</w:t>
       </w:r>
       <w:r>
-        <w:t xml:space="preserve">LOSO R² for apparent uptake (0.48–0.65 across the five scenarios) was far below random-split R² (0.86–0.89). Speciation features did not improve it, and a corpus of 20–30 studies cannot rank learners. The learning curve rose with the number of studies but was not monotonic at the replication used (§3.4).</w:t>
+        <w:t xml:space="preserve">LOSO R² for apparent uptake (0.48–0.65 across the five scenarios) was far below random-split R² (0.86–0.89). Speciation features did not improve it, and a corpus of 20–30 studies cannot rank learners. With 8 replicates per size, LOSO R² rose from 0.31 (12 studies) to 0.66 (48) and then levelled off (0.66 at 96; §3.4).</w:t>
       </w:r>
     </w:p>
     <w:p>
@@ -25333,7 +25432,7 @@
           <w:sz w:val="20"/>
           <w:szCs w:val="20"/>
         </w:rPr>
-        <w:t xml:space="preserve">abc123</w:t>
+        <w:t xml:space="preserve">9d5a37bd6012b6abf2cacbca284a97aada468f68</w:t>
       </w:r>
       <w:r>
         <w:t xml:space="preserve">;</w:t>
@@ -25820,7 +25919,7 @@
         <w:t xml:space="preserve">ji</w:t>
       </w:r>
       <w:r>
-        <w:t xml:space="preserve">-μ̂(x</w:t>
+        <w:t xml:space="preserve">−μ̂(x</w:t>
       </w:r>
       <w:r>
         <w:rPr>
@@ -25897,7 +25996,7 @@
         <w:jc w:val="both"/>
       </w:pPr>
       <w:r>
-        <w:t xml:space="preserve">For a miscoverage level α, let k=⌈(1-α)(J+1)⌉. Set q̂=s</w:t>
+        <w:t xml:space="preserve">For a miscoverage level α, let k=⌈(1−α)(J+1)⌉. Set q̂=s</w:t>
       </w:r>
       <w:r>
         <w:rPr>
@@ -25995,7 +26094,7 @@
           <w:i/>
           <w:iCs/>
         </w:rPr>
-        <w:t xml:space="preserve">-μ̂(x</w:t>
+        <w:t xml:space="preserve">−μ̂(x</w:t>
       </w:r>
       <w:r>
         <w:rPr>
@@ -26025,7 +26124,7 @@
           <w:i/>
           <w:iCs/>
         </w:rPr>
-        <w:t xml:space="preserve">⌉) ≥ 1-α .</w:t>
+        <w:t xml:space="preserve">⌉) ≥ 1−α .</w:t>
       </w:r>
     </w:p>
     <w:p>
@@ -26035,7 +26134,7 @@
         <w:jc w:val="both"/>
       </w:pPr>
       <w:r>
-        <w:t xml:space="preserve">In words: with probability at least 1-α, at least ⌈β n</w:t>
+        <w:t xml:space="preserve">In words: with probability at least 1−α, at least ⌈β n</w:t>
       </w:r>
       <w:r>
         <w:rPr>
@@ -26053,7 +26152,7 @@
         <w:t xml:space="preserve">J+1</w:t>
       </w:r>
       <w:r>
-        <w:t xml:space="preserve"> observations of a new study lie inside its intervals, so its within-study coverage is at least ⌈β n⌉/n≥β. If the scores are almost surely distinct, the probability is also at most 1-α+1/(J+1).</w:t>
+        <w:t xml:space="preserve"> observations of a new study lie inside its intervals, so its within-study coverage is at least ⌈β n⌉/n≥β. If the scores are almost surely distinct, the probability is also at most 1−α+1/(J+1).</w:t>
       </w:r>
     </w:p>
     <w:p>
@@ -26160,7 +26259,7 @@
         <w:t xml:space="preserve">(k)</w:t>
       </w:r>
       <w:r>
-        <w:t xml:space="preserve">)≥ k/(J+1)≥ 1-α.</w:t>
+        <w:t xml:space="preserve">)≥ k/(J+1)≥ 1−α.</w:t>
       </w:r>
     </w:p>
     <w:p>
@@ -26306,7 +26405,7 @@
         <w:t xml:space="preserve">Minimum number of calibration studies.</w:t>
       </w:r>
       <w:r>
-        <w:t xml:space="preserve"> The interval is finite only if J≥(1-α)/α: at least 9 calibration studies for α=0.10 and 19 for α=0.05. With half of the 29 training studies used for calibration (about 14), M2s is bounded at 90% and unbounded at 95%. For total-Cr endpoints only about 8 calibration studies are available, so M2s is unbounded even at 90%. This finite-sample limit is reported as a result, not hidden.</w:t>
+        <w:t xml:space="preserve"> The interval is finite only if J≥(1−α)/α: at least 9 calibration studies for α=0.10 and 19 for α=0.05. With half of the 29 training studies used for calibration (about 14), M2s is bounded at 90% and unbounded at 95%. For total-Cr endpoints only about 8 calibration studies are available, so M2s is unbounded even at 90%. This finite-sample limit is reported as a result, not hidden.</w:t>
       </w:r>
     </w:p>
     <w:p>
@@ -26338,7 +26437,7 @@
         <w:t xml:space="preserve">single random observation</w:t>
       </w:r>
       <w:r>
-        <w:t xml:space="preserve"> from a new group, using pooling, subsampling or repeated subsampling. M1 is our analogue of their weighted pooling. M2s targets a different, group-level (β,1-α) tolerance statement: a fraction β of a new study's observations, with confidence 1-α.</w:t>
+        <w:t xml:space="preserve"> from a new group, using pooling, subsampling or repeated subsampling. M1 is our analogue of their weighted pooling. M2s targets a different, group-level (β,1−α) tolerance statement: a fraction β of a new study's observations, with confidence 1−α.</w:t>
       </w:r>
     </w:p>
     <w:p>
@@ -26360,7 +26459,7 @@
         <w:t xml:space="preserve">M2 (CV+) has no proven guarantee.</w:t>
       </w:r>
       <w:r>
-        <w:t xml:space="preserve"> M2 uses the same study scores, but with K-fold models instead of a single split, as in the CV+ construction (Barber et al., 2021). The CV+ guarantee is proven for scalar residual scores of exchangeable data points. We have not shown that it extends to within-study quantile scores, so the v0.2 statement of a 1-2α guarantee for M2 is withdrawn. M2 is reported as an empirical method only.</w:t>
+        <w:t xml:space="preserve"> M2 uses the same study scores, but with K-fold models instead of a single split, as in the CV+ construction (Barber et al., 2021). The CV+ guarantee is proven for scalar residual scores of exchangeable data points. We have not shown that it extends to within-study quantile scores, so the v0.2 statement of a 1−2α guarantee for M2 is withdrawn. M2 is reported as an empirical method only.</w:t>
       </w:r>
     </w:p>
     <w:p>
@@ -26814,7 +26913,7 @@
         <w:t xml:space="preserve">o</w:t>
       </w:r>
       <w:r>
-        <w:t xml:space="preserve">bs-n</w:t>
+        <w:t xml:space="preserve">bs−n</w:t>
       </w:r>
       <w:r>
         <w:rPr>
@@ -27136,7 +27235,7 @@
         <w:rPr>
           <w:vertAlign w:val="superscript"/>
         </w:rPr>
-        <w:t xml:space="preserve">-1</w:t>
+        <w:t xml:space="preserve">−1</w:t>
       </w:r>
       <w:r>
         <w:t xml:space="preserve">_{ν,λ</w:t>
@@ -27671,6 +27770,7 @@
 <w:ftr xmlns:wpc="http://schemas.microsoft.com/office/word/2010/wordprocessingCanvas" xmlns:mc="http://schemas.openxmlformats.org/markup-compatibility/2006" xmlns:o="urn:schemas-microsoft-com:office:office" xmlns:r="http://schemas.openxmlformats.org/officeDocument/2006/relationships" xmlns:m="http://schemas.openxmlformats.org/officeDocument/2006/math" xmlns:v="urn:schemas-microsoft-com:vml" xmlns:wp14="http://schemas.microsoft.com/office/word/2010/wordprocessingDrawing" xmlns:wp="http://schemas.openxmlformats.org/drawingml/2006/wordprocessingDrawing" xmlns:w10="urn:schemas-microsoft-com:office:word" xmlns:w="http://schemas.openxmlformats.org/wordprocessingml/2006/main" xmlns:w14="http://schemas.microsoft.com/office/word/2010/wordml" xmlns:w15="http://schemas.microsoft.com/office/word/2012/wordml" xmlns:wpg="http://schemas.microsoft.com/office/word/2010/wordprocessingGroup" xmlns:wpi="http://schemas.microsoft.com/office/word/2010/wordprocessingInk" xmlns:wne="http://schemas.microsoft.com/office/word/2006/wordml" xmlns:wps="http://schemas.microsoft.com/office/word/2010/wordprocessingShape">
   <w:p>
     <w:pPr>
+      <w:suppressLineNumbers/>
       <w:jc w:val="center"/>
     </w:pPr>
     <w:r>

</xml_diff>

<commit_message>
Revision 3 deliverables: manuscript, supplement (S11-S13), response to third review (docx); manifest for code commit 0528c60
Co-Authored-By: Claude Opus 5.5 <noreply@anthropic.com>
Claude-Session: https://claude.ai/code/session_01GFzJmQTFtMep2it1kYJtwA
</commit_message>
<xml_diff>
--- a/cassia/manuscript/CASSIA_manuscript.docx
+++ b/cassia/manuscript/CASSIA_manuscript.docx
@@ -2127,7 +2127,7 @@
         <w:t xml:space="preserve">Cr(III) solubility.</w:t>
       </w:r>
       <w:r>
-        <w:t xml:space="preserve"> The v0.1 analysis relied on convergence of the PHREEQC phase-boundary option, which the reviewer rightly criticised. The saturation index of the Cr(III) hydroxide (Cr(OH)₃(am) in minteq.v4; Cr(OH)₃(A) in minteq) is now evaluated directly for solutions of prescribed dissolved Cr(III). Saturation is located by bisection on log₁₀ C between 10⁻⁶ and 5,000 mg L⁻¹. Every evaluation returns a status:</w:t>
+        <w:t xml:space="preserve"> Non-convergence of the PHREEQC phase-boundary option does not show that no solubility constraint exists, so it is not used. Instead, the saturation index of the Cr(III) hydroxide (Cr(OH)₃(am) in minteq.v4; Cr(OH)₃(A) in minteq) is evaluated directly for solutions of prescribed dissolved Cr(III). Saturation is located by bisection on log₁₀ C between 10⁻⁶ and 5,000 mg L⁻¹. Every evaluation returns a status:</w:t>
       </w:r>
     </w:p>
     <w:p>
@@ -3247,7 +3247,7 @@
         <w:t xml:space="preserve">pzc</w:t>
       </w:r>
       <w:r>
-        <w:t xml:space="preserve">. The family-level means of reductant capacity, leachable reductant and specific capacity are redrawn for every corpus from a common hyper-prior, so which family is most reductive is itself random across replicates. This removes the circularity identified by the reviewer, where the most reductive family was fixed by construction.</w:t>
+        <w:t xml:space="preserve">. The family-level means of reductant capacity, leachable reductant and specific capacity are redrawn for every corpus from a common hyper-prior, so which family is most reductive is itself random across replicates. No family is therefore most reductive by construction, and family rankings of reduction share in the outputs are not imposed by fixed inputs.</w:t>
       </w:r>
     </w:p>
     <w:p>
@@ -3338,7 +3338,34 @@
         <w:t xml:space="preserve">XPS</w:t>
       </w:r>
       <w:r>
-        <w:t xml:space="preserve"> is surface-sensitive. The reported Cr(III) fraction is e·f/(e·f + 1 − f) + b·(1 − ·), where f is the true fraction, e a per-study surface-enrichment factor (log-normal, SD 0.4) and b ~ U(0, 0.15) beam- or vacuum-induced reduction of Cr(VI) during analysis; the fitting noise is 0.05.</w:t>
+        <w:t xml:space="preserve"> is surface-sensitive. The reported Cr(III) fraction is f</w:t>
+      </w:r>
+      <w:r>
+        <w:rPr>
+          <w:vertAlign w:val="subscript"/>
+        </w:rPr>
+        <w:t xml:space="preserve">s</w:t>
+      </w:r>
+      <w:r>
+        <w:t xml:space="preserve"> + b(1 − f</w:t>
+      </w:r>
+      <w:r>
+        <w:rPr>
+          <w:vertAlign w:val="subscript"/>
+        </w:rPr>
+        <w:t xml:space="preserve">s</w:t>
+      </w:r>
+      <w:r>
+        <w:t xml:space="preserve">), with surface fraction f</w:t>
+      </w:r>
+      <w:r>
+        <w:rPr>
+          <w:vertAlign w:val="subscript"/>
+        </w:rPr>
+        <w:t xml:space="preserve">s</w:t>
+      </w:r>
+      <w:r>
+        <w:t xml:space="preserve"> = e·f/(e·f + 1 − f), where f is the true fraction, e a per-study surface-enrichment factor (log-normal, SD 0.4) and b ~ U(0, 0.15) beam- or vacuum-induced reduction of Cr(VI) during analysis; the fitting noise is 0.05.</w:t>
       </w:r>
     </w:p>
     <w:p>
@@ -3644,6 +3671,34 @@
       </w:pPr>
       <w:r>
         <w:t xml:space="preserve">Across-replicate variability gives Monte Carlo standard errors (MCSE).</w:t>
+      </w:r>
+    </w:p>
+    <w:p>
+      <w:pPr>
+        <w:keepNext w:val="false"/>
+        <w:spacing w:line="480" w:lineRule="auto"/>
+        <w:jc w:val="both"/>
+      </w:pPr>
+      <w:r>
+        <w:rPr>
+          <w:b/>
+          <w:bCs/>
+        </w:rPr>
+        <w:t xml:space="preserve">Number of replicates.</w:t>
+      </w:r>
+      <w:r>
+        <w:t xml:space="preserve"> The 100 replicate corpora per scenario were checked by a Monte Carlo precision analysis (</w:t>
+      </w:r>
+      <w:r>
+        <w:rPr>
+          <w:rFonts w:ascii="Courier New" w:cs="Courier New" w:eastAsia="Courier New" w:hAnsi="Courier New"/>
+          <w:sz w:val="20"/>
+          <w:szCs w:val="20"/>
+        </w:rPr>
+        <w:t xml:space="preserve">scripts/bench_partition.py</w:t>
+      </w:r>
+      <w:r>
+        <w:t xml:space="preserve">, Table S12). For each headline rate, the between-replicate SD s gives MCSE = s/√R and the number of replicates R = (1.96 s/h)² needed for a 95% half-width h. With R = 100, the MCSE was ≤ 0.010 for unconditional fit rates, ≤ 0.018 for rates conditional on reduction share &gt; 0.2, ≤ 0.006 for mean reduction shares and ≤ 0.020 for Spearman correlations. The contrasts on which conclusions rest are 0.1–0.4. A half-width of 0.01 on the unconditional fit rates would need 228–357 replicates; this precision is not needed for any conclusion and was not pursued.</w:t>
       </w:r>
     </w:p>
     <w:p>
@@ -4282,7 +4337,7 @@
         <w:jc w:val="both"/>
       </w:pPr>
       <w:r>
-        <w:t xml:space="preserve">(The v0.2 design D4, with unbiased solid oxidation state, is retained only for the profile likelihoods in Supplementary Fig. S1.)</w:t>
+        <w:t xml:space="preserve">(A further design, D4u, with an unbiased solid oxidation state, is used only for the profile likelihoods in Supplementary Fig. S1.)</w:t>
       </w:r>
     </w:p>
     <w:p>
@@ -4646,7 +4701,7 @@
         <w:t xml:space="preserve">assumed</w:t>
       </w:r>
       <w:r>
-        <w:t xml:space="preserve">). These v0.2 analyses use designs D1 and D3.</w:t>
+        <w:t xml:space="preserve">). These analyses use designs D1 and D3.</w:t>
       </w:r>
     </w:p>
     <w:p>
@@ -5157,7 +5212,608 @@
         <w:jc w:val="both"/>
       </w:pPr>
       <w:r>
-        <w:t xml:space="preserve">Three interval constructions were compared. All are calibrated on out-of-study residuals, with the study as the unit.</w:t>
+        <w:t xml:space="preserve">Four interval constructions were compared. All are calibrated on out-of-study residuals, with the study as the unit of resampling. They differ in the unit of the conformity score and in their guarantee:</w:t>
+      </w:r>
+    </w:p>
+    <w:tbl>
+      <w:tblPr>
+        <w:tblW w:type="dxa" w:w="9026"/>
+        <w:tblBorders>
+          <w:top w:val="single" w:color="000000" w:sz="8"/>
+          <w:left w:val="none" w:color="FFFFFF" w:sz="0"/>
+          <w:bottom w:val="single" w:color="000000" w:sz="8"/>
+          <w:right w:val="none" w:color="FFFFFF" w:sz="0"/>
+          <w:insideH w:val="none" w:color="FFFFFF" w:sz="0"/>
+          <w:insideV w:val="none" w:color="FFFFFF" w:sz="0"/>
+        </w:tblBorders>
+      </w:tblPr>
+      <w:tblGrid>
+        <w:gridCol w:w="882"/>
+        <w:gridCol w:w="2714"/>
+        <w:gridCol w:w="2714"/>
+        <w:gridCol w:w="2716"/>
+      </w:tblGrid>
+      <w:tr>
+        <w:trPr>
+          <w:tblHeader/>
+        </w:trPr>
+        <w:tc>
+          <w:tcPr>
+            <w:tcW w:type="dxa" w:w="882"/>
+            <w:tcBorders>
+              <w:top w:val="single" w:color="000000" w:sz="8"/>
+              <w:bottom w:val="single" w:color="000000" w:sz="8"/>
+            </w:tcBorders>
+            <w:tcMar>
+              <w:top w:type="dxa" w:w="40"/>
+              <w:left w:type="dxa" w:w="80"/>
+              <w:bottom w:type="dxa" w:w="40"/>
+              <w:right w:type="dxa" w:w="80"/>
+            </w:tcMar>
+          </w:tcPr>
+          <w:p>
+            <w:pPr>
+              <w:spacing w:line="240" w:lineRule="auto"/>
+            </w:pPr>
+            <w:r>
+              <w:rPr>
+                <w:b/>
+                <w:bCs/>
+                <w:sz w:val="20"/>
+                <w:szCs w:val="20"/>
+              </w:rPr>
+              <w:t xml:space="preserve">Method</w:t>
+            </w:r>
+          </w:p>
+        </w:tc>
+        <w:tc>
+          <w:tcPr>
+            <w:tcW w:type="dxa" w:w="2714"/>
+            <w:tcBorders>
+              <w:top w:val="single" w:color="000000" w:sz="8"/>
+              <w:bottom w:val="single" w:color="000000" w:sz="8"/>
+            </w:tcBorders>
+            <w:tcMar>
+              <w:top w:type="dxa" w:w="40"/>
+              <w:left w:type="dxa" w:w="80"/>
+              <w:bottom w:type="dxa" w:w="40"/>
+              <w:right w:type="dxa" w:w="80"/>
+            </w:tcMar>
+          </w:tcPr>
+          <w:p>
+            <w:pPr>
+              <w:spacing w:line="240" w:lineRule="auto"/>
+            </w:pPr>
+            <w:r>
+              <w:rPr>
+                <w:b/>
+                <w:bCs/>
+                <w:sz w:val="20"/>
+                <w:szCs w:val="20"/>
+              </w:rPr>
+              <w:t xml:space="preserve">Conformity score</w:t>
+            </w:r>
+          </w:p>
+        </w:tc>
+        <w:tc>
+          <w:tcPr>
+            <w:tcW w:type="dxa" w:w="2714"/>
+            <w:tcBorders>
+              <w:top w:val="single" w:color="000000" w:sz="8"/>
+              <w:bottom w:val="single" w:color="000000" w:sz="8"/>
+            </w:tcBorders>
+            <w:tcMar>
+              <w:top w:type="dxa" w:w="40"/>
+              <w:left w:type="dxa" w:w="80"/>
+              <w:bottom w:type="dxa" w:w="40"/>
+              <w:right w:type="dxa" w:w="80"/>
+            </w:tcMar>
+          </w:tcPr>
+          <w:p>
+            <w:pPr>
+              <w:spacing w:line="240" w:lineRule="auto"/>
+            </w:pPr>
+            <w:r>
+              <w:rPr>
+                <w:b/>
+                <w:bCs/>
+                <w:sz w:val="20"/>
+                <w:szCs w:val="20"/>
+              </w:rPr>
+              <w:t xml:space="preserve">Procedure class</w:t>
+            </w:r>
+          </w:p>
+        </w:tc>
+        <w:tc>
+          <w:tcPr>
+            <w:tcW w:type="dxa" w:w="2716"/>
+            <w:tcBorders>
+              <w:top w:val="single" w:color="000000" w:sz="8"/>
+              <w:bottom w:val="single" w:color="000000" w:sz="8"/>
+            </w:tcBorders>
+            <w:tcMar>
+              <w:top w:type="dxa" w:w="40"/>
+              <w:left w:type="dxa" w:w="80"/>
+              <w:bottom w:type="dxa" w:w="40"/>
+              <w:right w:type="dxa" w:w="80"/>
+            </w:tcMar>
+          </w:tcPr>
+          <w:p>
+            <w:pPr>
+              <w:spacing w:line="240" w:lineRule="auto"/>
+            </w:pPr>
+            <w:r>
+              <w:rPr>
+                <w:b/>
+                <w:bCs/>
+                <w:sz w:val="20"/>
+                <w:szCs w:val="20"/>
+              </w:rPr>
+              <w:t xml:space="preserve">Coverage statement</w:t>
+            </w:r>
+          </w:p>
+        </w:tc>
+      </w:tr>
+      <w:tr>
+        <w:trPr>
+          <w:tblHeader w:val="false"/>
+        </w:trPr>
+        <w:tc>
+          <w:tcPr>
+            <w:tcW w:type="dxa" w:w="882"/>
+            <w:tcMar>
+              <w:top w:type="dxa" w:w="40"/>
+              <w:left w:type="dxa" w:w="80"/>
+              <w:bottom w:type="dxa" w:w="40"/>
+              <w:right w:type="dxa" w:w="80"/>
+            </w:tcMar>
+          </w:tcPr>
+          <w:p>
+            <w:pPr>
+              <w:spacing w:line="240" w:lineRule="auto"/>
+            </w:pPr>
+            <w:r>
+              <w:rPr>
+                <w:b w:val="false"/>
+                <w:bCs w:val="false"/>
+                <w:sz w:val="20"/>
+                <w:szCs w:val="20"/>
+              </w:rPr>
+              <w:t xml:space="preserve">M0</w:t>
+            </w:r>
+          </w:p>
+        </w:tc>
+        <w:tc>
+          <w:tcPr>
+            <w:tcW w:type="dxa" w:w="2714"/>
+            <w:tcMar>
+              <w:top w:type="dxa" w:w="40"/>
+              <w:left w:type="dxa" w:w="80"/>
+              <w:bottom w:type="dxa" w:w="40"/>
+              <w:right w:type="dxa" w:w="80"/>
+            </w:tcMar>
+          </w:tcPr>
+          <w:p>
+            <w:pPr>
+              <w:spacing w:line="240" w:lineRule="auto"/>
+            </w:pPr>
+            <w:r>
+              <w:rPr>
+                <w:b w:val="false"/>
+                <w:bCs w:val="false"/>
+                <w:sz w:val="20"/>
+                <w:szCs w:val="20"/>
+              </w:rPr>
+              <w:t xml:space="preserve">one score per observation, pooled</w:t>
+            </w:r>
+          </w:p>
+        </w:tc>
+        <w:tc>
+          <w:tcPr>
+            <w:tcW w:type="dxa" w:w="2714"/>
+            <w:tcMar>
+              <w:top w:type="dxa" w:w="40"/>
+              <w:left w:type="dxa" w:w="80"/>
+              <w:bottom w:type="dxa" w:w="40"/>
+              <w:right w:type="dxa" w:w="80"/>
+            </w:tcMar>
+          </w:tcPr>
+          <w:p>
+            <w:pPr>
+              <w:spacing w:line="240" w:lineRule="auto"/>
+            </w:pPr>
+            <w:r>
+              <w:rPr>
+                <w:b w:val="false"/>
+                <w:bCs w:val="false"/>
+                <w:sz w:val="20"/>
+                <w:szCs w:val="20"/>
+              </w:rPr>
+              <w:t xml:space="preserve">inner grouped K-fold residuals (cross-validation residual method; neither split nor cross-conformal in the formal sense)</w:t>
+            </w:r>
+          </w:p>
+        </w:tc>
+        <w:tc>
+          <w:tcPr>
+            <w:tcW w:type="dxa" w:w="2716"/>
+            <w:tcMar>
+              <w:top w:type="dxa" w:w="40"/>
+              <w:left w:type="dxa" w:w="80"/>
+              <w:bottom w:type="dxa" w:w="40"/>
+              <w:right w:type="dxa" w:w="80"/>
+            </w:tcMar>
+          </w:tcPr>
+          <w:p>
+            <w:pPr>
+              <w:spacing w:line="240" w:lineRule="auto"/>
+            </w:pPr>
+            <w:r>
+              <w:rPr>
+                <w:b w:val="false"/>
+                <w:bCs w:val="false"/>
+                <w:sz w:val="20"/>
+                <w:szCs w:val="20"/>
+              </w:rPr>
+              <w:t xml:space="preserve">none for a new study</w:t>
+            </w:r>
+          </w:p>
+        </w:tc>
+      </w:tr>
+      <w:tr>
+        <w:trPr>
+          <w:tblHeader w:val="false"/>
+        </w:trPr>
+        <w:tc>
+          <w:tcPr>
+            <w:tcW w:type="dxa" w:w="882"/>
+            <w:tcMar>
+              <w:top w:type="dxa" w:w="40"/>
+              <w:left w:type="dxa" w:w="80"/>
+              <w:bottom w:type="dxa" w:w="40"/>
+              <w:right w:type="dxa" w:w="80"/>
+            </w:tcMar>
+          </w:tcPr>
+          <w:p>
+            <w:pPr>
+              <w:spacing w:line="240" w:lineRule="auto"/>
+            </w:pPr>
+            <w:r>
+              <w:rPr>
+                <w:b w:val="false"/>
+                <w:bCs w:val="false"/>
+                <w:sz w:val="20"/>
+                <w:szCs w:val="20"/>
+              </w:rPr>
+              <w:t xml:space="preserve">M1</w:t>
+            </w:r>
+          </w:p>
+        </w:tc>
+        <w:tc>
+          <w:tcPr>
+            <w:tcW w:type="dxa" w:w="2714"/>
+            <w:tcMar>
+              <w:top w:type="dxa" w:w="40"/>
+              <w:left w:type="dxa" w:w="80"/>
+              <w:bottom w:type="dxa" w:w="40"/>
+              <w:right w:type="dxa" w:w="80"/>
+            </w:tcMar>
+          </w:tcPr>
+          <w:p>
+            <w:pPr>
+              <w:spacing w:line="240" w:lineRule="auto"/>
+            </w:pPr>
+            <w:r>
+              <w:rPr>
+                <w:b w:val="false"/>
+                <w:bCs w:val="false"/>
+                <w:sz w:val="20"/>
+                <w:szCs w:val="20"/>
+              </w:rPr>
+              <w:t xml:space="preserve">one score per observation, weighted 1/n</w:t>
+            </w:r>
+            <w:r>
+              <w:rPr>
+                <w:b w:val="false"/>
+                <w:bCs w:val="false"/>
+                <w:sz w:val="20"/>
+                <w:szCs w:val="20"/>
+                <w:vertAlign w:val="subscript"/>
+              </w:rPr>
+              <w:t xml:space="preserve">j</w:t>
+            </w:r>
+            <w:r>
+              <w:rPr>
+                <w:b w:val="false"/>
+                <w:bCs w:val="false"/>
+                <w:sz w:val="20"/>
+                <w:szCs w:val="20"/>
+              </w:rPr>
+              <w:t xml:space="preserve"> per study</w:t>
+            </w:r>
+          </w:p>
+        </w:tc>
+        <w:tc>
+          <w:tcPr>
+            <w:tcW w:type="dxa" w:w="2714"/>
+            <w:tcMar>
+              <w:top w:type="dxa" w:w="40"/>
+              <w:left w:type="dxa" w:w="80"/>
+              <w:bottom w:type="dxa" w:w="40"/>
+              <w:right w:type="dxa" w:w="80"/>
+            </w:tcMar>
+          </w:tcPr>
+          <w:p>
+            <w:pPr>
+              <w:spacing w:line="240" w:lineRule="auto"/>
+            </w:pPr>
+            <w:r>
+              <w:rPr>
+                <w:b w:val="false"/>
+                <w:bCs w:val="false"/>
+                <w:sz w:val="20"/>
+                <w:szCs w:val="20"/>
+              </w:rPr>
+              <w:t xml:space="preserve">study-level CV+ (Barber et al., 2021) with group weights</w:t>
+            </w:r>
+          </w:p>
+        </w:tc>
+        <w:tc>
+          <w:tcPr>
+            <w:tcW w:type="dxa" w:w="2716"/>
+            <w:tcMar>
+              <w:top w:type="dxa" w:w="40"/>
+              <w:left w:type="dxa" w:w="80"/>
+              <w:bottom w:type="dxa" w:w="40"/>
+              <w:right w:type="dxa" w:w="80"/>
+            </w:tcMar>
+          </w:tcPr>
+          <w:p>
+            <w:pPr>
+              <w:spacing w:line="240" w:lineRule="auto"/>
+            </w:pPr>
+            <w:r>
+              <w:rPr>
+                <w:b w:val="false"/>
+                <w:bCs w:val="false"/>
+                <w:sz w:val="20"/>
+                <w:szCs w:val="20"/>
+              </w:rPr>
+              <w:t xml:space="preserve">none claimed; targets coverage of a random observation of a new study</w:t>
+            </w:r>
+          </w:p>
+        </w:tc>
+      </w:tr>
+      <w:tr>
+        <w:trPr>
+          <w:tblHeader w:val="false"/>
+        </w:trPr>
+        <w:tc>
+          <w:tcPr>
+            <w:tcW w:type="dxa" w:w="882"/>
+            <w:tcMar>
+              <w:top w:type="dxa" w:w="40"/>
+              <w:left w:type="dxa" w:w="80"/>
+              <w:bottom w:type="dxa" w:w="40"/>
+              <w:right w:type="dxa" w:w="80"/>
+            </w:tcMar>
+          </w:tcPr>
+          <w:p>
+            <w:pPr>
+              <w:spacing w:line="240" w:lineRule="auto"/>
+            </w:pPr>
+            <w:r>
+              <w:rPr>
+                <w:b w:val="false"/>
+                <w:bCs w:val="false"/>
+                <w:sz w:val="20"/>
+                <w:szCs w:val="20"/>
+              </w:rPr>
+              <w:t xml:space="preserve">M2</w:t>
+            </w:r>
+          </w:p>
+        </w:tc>
+        <w:tc>
+          <w:tcPr>
+            <w:tcW w:type="dxa" w:w="2714"/>
+            <w:tcMar>
+              <w:top w:type="dxa" w:w="40"/>
+              <w:left w:type="dxa" w:w="80"/>
+              <w:bottom w:type="dxa" w:w="40"/>
+              <w:right w:type="dxa" w:w="80"/>
+            </w:tcMar>
+          </w:tcPr>
+          <w:p>
+            <w:pPr>
+              <w:spacing w:line="240" w:lineRule="auto"/>
+            </w:pPr>
+            <w:r>
+              <w:rPr>
+                <w:b w:val="false"/>
+                <w:bCs w:val="false"/>
+                <w:sz w:val="20"/>
+                <w:szCs w:val="20"/>
+              </w:rPr>
+              <w:t xml:space="preserve">one score per study (within-study 0.9-quantile)</w:t>
+            </w:r>
+          </w:p>
+        </w:tc>
+        <w:tc>
+          <w:tcPr>
+            <w:tcW w:type="dxa" w:w="2714"/>
+            <w:tcMar>
+              <w:top w:type="dxa" w:w="40"/>
+              <w:left w:type="dxa" w:w="80"/>
+              <w:bottom w:type="dxa" w:w="40"/>
+              <w:right w:type="dxa" w:w="80"/>
+            </w:tcMar>
+          </w:tcPr>
+          <w:p>
+            <w:pPr>
+              <w:spacing w:line="240" w:lineRule="auto"/>
+            </w:pPr>
+            <w:r>
+              <w:rPr>
+                <w:b w:val="false"/>
+                <w:bCs w:val="false"/>
+                <w:sz w:val="20"/>
+                <w:szCs w:val="20"/>
+              </w:rPr>
+              <w:t xml:space="preserve">study-level CV+</w:t>
+            </w:r>
+          </w:p>
+        </w:tc>
+        <w:tc>
+          <w:tcPr>
+            <w:tcW w:type="dxa" w:w="2716"/>
+            <w:tcMar>
+              <w:top w:type="dxa" w:w="40"/>
+              <w:left w:type="dxa" w:w="80"/>
+              <w:bottom w:type="dxa" w:w="40"/>
+              <w:right w:type="dxa" w:w="80"/>
+            </w:tcMar>
+          </w:tcPr>
+          <w:p>
+            <w:pPr>
+              <w:spacing w:line="240" w:lineRule="auto"/>
+            </w:pPr>
+            <w:r>
+              <w:rPr>
+                <w:b w:val="false"/>
+                <w:bCs w:val="false"/>
+                <w:sz w:val="20"/>
+                <w:szCs w:val="20"/>
+              </w:rPr>
+              <w:t xml:space="preserve">none claimed (Appendix A, Remark 5)</w:t>
+            </w:r>
+          </w:p>
+        </w:tc>
+      </w:tr>
+      <w:tr>
+        <w:trPr>
+          <w:tblHeader w:val="false"/>
+        </w:trPr>
+        <w:tc>
+          <w:tcPr>
+            <w:tcW w:type="dxa" w:w="882"/>
+            <w:tcBorders>
+              <w:bottom w:val="single" w:color="000000" w:sz="8"/>
+            </w:tcBorders>
+            <w:tcMar>
+              <w:top w:type="dxa" w:w="40"/>
+              <w:left w:type="dxa" w:w="80"/>
+              <w:bottom w:type="dxa" w:w="40"/>
+              <w:right w:type="dxa" w:w="80"/>
+            </w:tcMar>
+          </w:tcPr>
+          <w:p>
+            <w:pPr>
+              <w:spacing w:line="240" w:lineRule="auto"/>
+            </w:pPr>
+            <w:r>
+              <w:rPr>
+                <w:b w:val="false"/>
+                <w:bCs w:val="false"/>
+                <w:sz w:val="20"/>
+                <w:szCs w:val="20"/>
+              </w:rPr>
+              <w:t xml:space="preserve">M2s</w:t>
+            </w:r>
+          </w:p>
+        </w:tc>
+        <w:tc>
+          <w:tcPr>
+            <w:tcW w:type="dxa" w:w="2714"/>
+            <w:tcBorders>
+              <w:bottom w:val="single" w:color="000000" w:sz="8"/>
+            </w:tcBorders>
+            <w:tcMar>
+              <w:top w:type="dxa" w:w="40"/>
+              <w:left w:type="dxa" w:w="80"/>
+              <w:bottom w:type="dxa" w:w="40"/>
+              <w:right w:type="dxa" w:w="80"/>
+            </w:tcMar>
+          </w:tcPr>
+          <w:p>
+            <w:pPr>
+              <w:spacing w:line="240" w:lineRule="auto"/>
+            </w:pPr>
+            <w:r>
+              <w:rPr>
+                <w:b w:val="false"/>
+                <w:bCs w:val="false"/>
+                <w:sz w:val="20"/>
+                <w:szCs w:val="20"/>
+              </w:rPr>
+              <w:t xml:space="preserve">one score per study (within-study 0.9-quantile)</w:t>
+            </w:r>
+          </w:p>
+        </w:tc>
+        <w:tc>
+          <w:tcPr>
+            <w:tcW w:type="dxa" w:w="2714"/>
+            <w:tcBorders>
+              <w:bottom w:val="single" w:color="000000" w:sz="8"/>
+            </w:tcBorders>
+            <w:tcMar>
+              <w:top w:type="dxa" w:w="40"/>
+              <w:left w:type="dxa" w:w="80"/>
+              <w:bottom w:type="dxa" w:w="40"/>
+              <w:right w:type="dxa" w:w="80"/>
+            </w:tcMar>
+          </w:tcPr>
+          <w:p>
+            <w:pPr>
+              <w:spacing w:line="240" w:lineRule="auto"/>
+            </w:pPr>
+            <w:r>
+              <w:rPr>
+                <w:b w:val="false"/>
+                <w:bCs w:val="false"/>
+                <w:sz w:val="20"/>
+                <w:szCs w:val="20"/>
+              </w:rPr>
+              <w:t xml:space="preserve">split conformal over studies</w:t>
+            </w:r>
+          </w:p>
+        </w:tc>
+        <w:tc>
+          <w:tcPr>
+            <w:tcW w:type="dxa" w:w="2716"/>
+            <w:tcBorders>
+              <w:bottom w:val="single" w:color="000000" w:sz="8"/>
+            </w:tcBorders>
+            <w:tcMar>
+              <w:top w:type="dxa" w:w="40"/>
+              <w:left w:type="dxa" w:w="80"/>
+              <w:bottom w:type="dxa" w:w="40"/>
+              <w:right w:type="dxa" w:w="80"/>
+            </w:tcMar>
+          </w:tcPr>
+          <w:p>
+            <w:pPr>
+              <w:spacing w:line="240" w:lineRule="auto"/>
+            </w:pPr>
+            <w:r>
+              <w:rPr>
+                <w:b w:val="false"/>
+                <w:bCs w:val="false"/>
+                <w:sz w:val="20"/>
+                <w:szCs w:val="20"/>
+              </w:rPr>
+              <w:t xml:space="preserve">exact: P(≥ ⌈0.9 n⌉ of a new study's n observations covered) ≥ 1 − α (Appendix A)</w:t>
+            </w:r>
+          </w:p>
+        </w:tc>
+      </w:tr>
+    </w:tbl>
+    <w:p>
+      <w:pPr>
+        <w:keepNext w:val="false"/>
+        <w:spacing w:before="200" w:line="480" w:lineRule="auto"/>
+        <w:jc w:val="both"/>
+      </w:pPr>
+      <w:r>
+        <w:t xml:space="preserve">Only M2s carries a proven study-level guarantee. The coverage of M0–M2 for unseen studies is established empirically, by outer leave-one-study-out evaluation, and reported per study.</w:t>
       </w:r>
     </w:p>
     <w:p>
@@ -5174,7 +5830,7 @@
           <w:b/>
           <w:bCs/>
         </w:rPr>
-        <w:t xml:space="preserve">M0 – pooled residuals (v0.1 method).</w:t>
+        <w:t xml:space="preserve">M0 – pooled residuals (the conventional approach).</w:t>
       </w:r>
       <w:r>
         <w:t xml:space="preserve"> The half-width is the ⌈(n+1)(1−α)⌉/n quantile of pooled absolute residuals from an inner grouped 10-fold CV. Residuals within a study are dependent, so M0 has no formal guarantee for a new study.</w:t>
@@ -5347,7 +6003,7 @@
         <w:t xml:space="preserve">Status:</w:t>
       </w:r>
       <w:r>
-        <w:t xml:space="preserve"> the v0.2 claim of a 1 − 2α guarantee is withdrawn. The CV+ bound is proven for scalar scores of exchangeable points, and its extension to within-study quantile scores is not established (Appendix A).</w:t>
+        <w:t xml:space="preserve"> no coverage guarantee is claimed. The CV+ bound is proven for scalar scores of exchangeable points, and its extension to within-study quantile scores is not established (Appendix A).</w:t>
       </w:r>
     </w:p>
     <w:p>
@@ -5552,7 +6208,7 @@
         <w:t xml:space="preserve">Models.</w:t>
       </w:r>
       <w:r>
-        <w:t xml:space="preserve"> Residual Cr(VI) and residual total Cr are modelled directly (Section 2.7), each with its own M1 interval. Modelling effluent through q, as in v0.1, is ill-conditioned when removal approaches completeness.</w:t>
+        <w:t xml:space="preserve"> Residual Cr(VI) and residual total Cr are modelled directly (Section 2.7), each with its own M1 interval. Modelling effluent indirectly through q is ill-conditioned when removal approaches completeness.</w:t>
       </w:r>
     </w:p>
     <w:p>
@@ -5757,7 +6413,7 @@
           <w:b/>
           <w:bCs/>
         </w:rPr>
-        <w:t xml:space="preserve">(i) v0.2 rule:</w:t>
+        <w:t xml:space="preserve">(i) Simple rule:</w:t>
       </w:r>
       <w:r>
         <w:t xml:space="preserve"> duplicates; accept when both mean measured concentrations are ≤ 90% of their limits.</w:t>
@@ -6222,7 +6878,7 @@
         <w:t xml:space="preserve">Safeguards.</w:t>
       </w:r>
       <w:r>
-        <w:t xml:space="preserve"> The scientific design and the reviewer-driven changes were specified by the author. The correctness checks built into the work are:</w:t>
+        <w:t xml:space="preserve"> The scientific design and all methodological choices were specified by the author. The correctness checks built into the work are:</w:t>
       </w:r>
     </w:p>
     <w:p>
@@ -6474,7 +7130,7 @@
         <w:spacing w:line="480" w:lineRule="auto"/>
       </w:pPr>
       <w:r>
-        <w:t xml:space="preserve">A single isotherm spanning 5–300 mg L⁻¹ therefore samples materially different sorbate mixtures. This is why the revised simulator evaluates speciation at the current dissolved Cr(VI) (reviewer comment 3A).</w:t>
+        <w:t xml:space="preserve">A single isotherm spanning 5–300 mg L⁻¹ therefore samples materially different sorbate mixtures. This is why the revised simulator evaluates speciation at the current dissolved Cr(VI).</w:t>
       </w:r>
     </w:p>
     <w:p>
@@ -7053,7 +7709,7 @@
         <w:t xml:space="preserve">between-database</w:t>
       </w:r>
       <w:r>
-        <w:t xml:space="preserve"> difference, not an independently validated uncertainty interval for real systems (reviewer comment 3C).</w:t>
+        <w:t xml:space="preserve"> difference, not an independently validated uncertainty interval for real systems.</w:t>
       </w:r>
     </w:p>
     <w:p>
@@ -7930,7 +8586,7 @@
         <w:jc w:val="both"/>
       </w:pPr>
       <w:r>
-        <w:t xml:space="preserve">In scenario E the removed chromium was distributed as follows (medians): 0.62 adsorbed Cr(VI), 0.24 dissolved Cr(III), 0.045 Cr(III) on the solid and essentially no precipitate (95th percentile 0.065), consistent with the Cr(OH)₃ undersaturation at the isotherm pH of 1.8–3.5 (Section 3.1). The distributions are shown in Fig. 2a,d.</w:t>
+        <w:t xml:space="preserve">In scenario E the removed chromium was distributed as follows (medians): 0.62 adsorbed Cr(VI), 0.24 dissolved Cr(III), 0.045 Cr(III) on the solid and essentially no precipitate (95th percentile 0.065), consistent with the Cr(OH)₃ undersaturation at the isotherm pH of 1.8–3.5 (Section 3.1). The distributions are shown in Fig. 2a,d, and the full partition (adsorbed Cr(VI), dissolved Cr(III), Cr(III) on the solid, precipitate) for every scenario is given in Table S11. Precipitation was absent in scenarios A–D by construction and small in E (mean 0.017). All headline rates have MCSE ≤ 0.02 at 100 replicates (Table S12).</w:t>
       </w:r>
     </w:p>
     <w:p>
@@ -9015,7 +9671,7 @@
         <w:spacing w:line="480" w:lineRule="auto"/>
       </w:pPr>
       <w:r>
-        <w:t xml:space="preserve">This is a property of the simulator and must not be read as an empirical statement about hydrochars (reviewer comment 2).</w:t>
+        <w:t xml:space="preserve">This is a property of the simulator and must not be read as an empirical statement about hydrochars.</w:t>
       </w:r>
     </w:p>
     <w:p>
@@ -11639,7 +12295,7 @@
           <w:b/>
           <w:bCs/>
         </w:rPr>
-        <w:t xml:space="preserve">Profile likelihood (Supplementary Fig. S1; v0.2 designs).</w:t>
+        <w:t xml:space="preserve">Profile likelihood (Supplementary Fig. S1; designs D1, D3, D4u).</w:t>
       </w:r>
       <w:r>
         <w:t xml:space="preserve"> All profile points met the optimiser convergence criterion, but some profiles are not smooth (e.g. a peak at +0.6 log units for study VS002), indicating local optima at those points; the true profile lies at or below the plotted curve, so these profiles are indicative only; the minimum −2 log L was consistent with the number of observations (3.4 for n = 14 under D1; 21–79 for n = 44–61 under D3/D4).</w:t>
@@ -11726,7 +12382,7 @@
           <w:b/>
           <w:bCs/>
         </w:rPr>
-        <w:t xml:space="preserve">Misreported metadata (v0.2 designs D1, D3).</w:t>
+        <w:t xml:space="preserve">Misreported metadata (designs D1, D3).</w:t>
       </w:r>
     </w:p>
     <w:p>
@@ -12701,7 +13357,7 @@
         <w:jc w:val="both"/>
       </w:pPr>
       <w:r>
-        <w:t xml:space="preserve">The hypothesis that chemistry-informed features improve predictive reliability (RQ1 of v0.1) is not supported. The speciation fractions are smooth functions of pH, C₀, I and T, which are already inputs, so tree models gain nothing from them (§4.3).</w:t>
+        <w:t xml:space="preserve">The hypothesis that chemistry-informed features improve predictive reliability is not supported. The speciation fractions are smooth functions of pH, C₀, I and T, which are already inputs, so tree models gain nothing from them (§4.3).</w:t>
       </w:r>
     </w:p>
     <w:p>
@@ -12844,7 +13500,7 @@
         <w:t xml:space="preserve">More studies help, more rows do not (Fig. 5b).</w:t>
       </w:r>
       <w:r>
-        <w:t xml:space="preserve"> The learning curve was repeated with 8 replicate corpora per size (v0.2 used 4, and its curve was not monotonic: 0.47, 0.59, 0.56, 0.75):</w:t>
+        <w:t xml:space="preserve"> The learning curve was computed with 8 replicate corpora per size. An earlier run with 4 replicates (Fig. 4b) was not monotonic (0.47, 0.59, 0.56, 0.75):</w:t>
       </w:r>
     </w:p>
     <w:p>
@@ -12870,7 +13526,7 @@
         <w:spacing w:line="480" w:lineRule="auto"/>
       </w:pPr>
       <w:r>
-        <w:t xml:space="preserve">With 8 replicates the curve is monotonic in its means but levels off beyond about 48 studies. The 48- and 96-study means differ by less than their SE. The v0.2 dip at 48 studies and its higher value at 96 were therefore replicate noise.</w:t>
+        <w:t xml:space="preserve">With 8 replicates the curve is monotonic in its means but levels off beyond about 48 studies. The 48- and 96-study means differ by less than their SE. The dip at 48 studies in the 4-replicate run and its higher value at 96 were therefore replicate noise.</w:t>
       </w:r>
     </w:p>
     <w:p>
@@ -14333,7 +14989,7 @@
           <w:sz w:val="22"/>
           <w:szCs w:val="22"/>
         </w:rPr>
-        <w:t xml:space="preserve"> Transferability of ML models (synthetic; 20 corpora of 30 studies). (a) R² for apparent Cr(VI) uptake under five validation schemes (bars: mean; whiskers: 2.5–97.5% range across corpora). (b) Learning curve from v0.2: R² against the number of independent studies (RF with speciation features; mean ± SD of 4 replicates); superseded by the 8-replicate curve in Fig. 5b. (c) Per-study RMSE under leave-one-study-out by family (ACc/ACp: chemically/physically activated carbon; BCw/BCm: wood/manure biochar; HC: hydrochar; PC: biomass-derived porous carbon).</w:t>
+        <w:t xml:space="preserve"> Transferability of ML models (synthetic; 20 corpora of 30 studies). (a) R² for apparent Cr(VI) uptake under five validation schemes (bars: mean; whiskers: 2.5–97.5% range across corpora). (b) Learning curve with 4 replicates: R² against the number of independent studies (RF with speciation features; mean ± SD of 4 replicates); superseded by the 8-replicate curve in Fig. 5b. (c) Per-study RMSE under leave-one-study-out by family (ACc/ACp: chemically/physically activated carbon; BCw/BCm: wood/manure biochar; HC: hydrochar; PC: biomass-derived porous carbon).</w:t>
       </w:r>
     </w:p>
     <w:p>
@@ -14460,7 +15116,7 @@
         <w:spacing w:line="480" w:lineRule="auto"/>
       </w:pPr>
       <w:r>
-        <w:t xml:space="preserve">The pooled-residual interval M0 (the v0.1 method) reached its nominal </w:t>
+        <w:t xml:space="preserve">The pooled-residual interval M0 (the conventional approach) reached its nominal </w:t>
       </w:r>
       <w:r>
         <w:rPr>
@@ -19513,7 +20169,7 @@
         <w:spacing w:line="480" w:lineRule="auto"/>
       </w:pPr>
       <w:r>
-        <w:t xml:space="preserve">v0.2 rule (duplicates, mean ≤ 90% of each limit): mean 0.01% across materials, worst material 1.4–1.7%;</w:t>
+        <w:t xml:space="preserve">simple rule (duplicates, mean ≤ 90% of each limit): mean 0.01% across materials, worst material 1.4–1.7%;</w:t>
       </w:r>
     </w:p>
     <w:p>
@@ -19644,7 +20300,7 @@
                 <w:sz w:val="20"/>
                 <w:szCs w:val="20"/>
               </w:rPr>
-              <w:t xml:space="preserve">v0.2 rule</w:t>
+              <w:t xml:space="preserve">Simple rule</w:t>
             </w:r>
           </w:p>
         </w:tc>
@@ -19988,13 +20644,13 @@
         </w:tblBorders>
       </w:tblPr>
       <w:tblGrid>
-        <w:gridCol w:w="961"/>
-        <w:gridCol w:w="2293"/>
-        <w:gridCol w:w="961"/>
-        <w:gridCol w:w="1775"/>
-        <w:gridCol w:w="1035"/>
-        <w:gridCol w:w="1035"/>
-        <w:gridCol w:w="966"/>
+        <w:gridCol w:w="953"/>
+        <w:gridCol w:w="2348"/>
+        <w:gridCol w:w="953"/>
+        <w:gridCol w:w="1761"/>
+        <w:gridCol w:w="1027"/>
+        <w:gridCol w:w="1027"/>
+        <w:gridCol w:w="957"/>
       </w:tblGrid>
       <w:tr>
         <w:trPr>
@@ -20002,7 +20658,7 @@
         </w:trPr>
         <w:tc>
           <w:tcPr>
-            <w:tcW w:type="dxa" w:w="961"/>
+            <w:tcW w:type="dxa" w:w="953"/>
             <w:tcBorders>
               <w:top w:val="single" w:color="000000" w:sz="8"/>
               <w:bottom w:val="single" w:color="000000" w:sz="8"/>
@@ -20031,7 +20687,7 @@
         </w:tc>
         <w:tc>
           <w:tcPr>
-            <w:tcW w:type="dxa" w:w="2293"/>
+            <w:tcW w:type="dxa" w:w="2348"/>
             <w:tcBorders>
               <w:top w:val="single" w:color="000000" w:sz="8"/>
               <w:bottom w:val="single" w:color="000000" w:sz="8"/>
@@ -20060,7 +20716,7 @@
         </w:tc>
         <w:tc>
           <w:tcPr>
-            <w:tcW w:type="dxa" w:w="961"/>
+            <w:tcW w:type="dxa" w:w="953"/>
             <w:tcBorders>
               <w:top w:val="single" w:color="000000" w:sz="8"/>
               <w:bottom w:val="single" w:color="000000" w:sz="8"/>
@@ -20089,7 +20745,7 @@
         </w:tc>
         <w:tc>
           <w:tcPr>
-            <w:tcW w:type="dxa" w:w="1775"/>
+            <w:tcW w:type="dxa" w:w="1761"/>
             <w:tcBorders>
               <w:top w:val="single" w:color="000000" w:sz="8"/>
               <w:bottom w:val="single" w:color="000000" w:sz="8"/>
@@ -20118,7 +20774,7 @@
         </w:tc>
         <w:tc>
           <w:tcPr>
-            <w:tcW w:type="dxa" w:w="1035"/>
+            <w:tcW w:type="dxa" w:w="1027"/>
             <w:tcBorders>
               <w:top w:val="single" w:color="000000" w:sz="8"/>
               <w:bottom w:val="single" w:color="000000" w:sz="8"/>
@@ -20147,7 +20803,7 @@
         </w:tc>
         <w:tc>
           <w:tcPr>
-            <w:tcW w:type="dxa" w:w="1035"/>
+            <w:tcW w:type="dxa" w:w="1027"/>
             <w:tcBorders>
               <w:top w:val="single" w:color="000000" w:sz="8"/>
               <w:bottom w:val="single" w:color="000000" w:sz="8"/>
@@ -20176,7 +20832,7 @@
         </w:tc>
         <w:tc>
           <w:tcPr>
-            <w:tcW w:type="dxa" w:w="966"/>
+            <w:tcW w:type="dxa" w:w="957"/>
             <w:tcBorders>
               <w:top w:val="single" w:color="000000" w:sz="8"/>
               <w:bottom w:val="single" w:color="000000" w:sz="8"/>
@@ -20210,7 +20866,7 @@
         </w:trPr>
         <w:tc>
           <w:tcPr>
-            <w:tcW w:type="dxa" w:w="961"/>
+            <w:tcW w:type="dxa" w:w="953"/>
             <w:tcMar>
               <w:top w:type="dxa" w:w="40"/>
               <w:left w:type="dxa" w:w="80"/>
@@ -20235,32 +20891,32 @@
         </w:tc>
         <w:tc>
           <w:tcPr>
-            <w:tcW w:type="dxa" w:w="2293"/>
-            <w:tcMar>
-              <w:top w:type="dxa" w:w="40"/>
-              <w:left w:type="dxa" w:w="80"/>
-              <w:bottom w:type="dxa" w:w="40"/>
-              <w:right w:type="dxa" w:w="80"/>
-            </w:tcMar>
-          </w:tcPr>
-          <w:p>
-            <w:pPr>
-              <w:spacing w:line="240" w:lineRule="auto"/>
-            </w:pPr>
-            <w:r>
-              <w:rPr>
-                <w:b w:val="false"/>
-                <w:bCs w:val="false"/>
-                <w:sz w:val="20"/>
-                <w:szCs w:val="20"/>
-              </w:rPr>
-              <w:t xml:space="preserve">v0.2 (n = 2, mean ≤ 0.9·limit)</w:t>
-            </w:r>
-          </w:p>
-        </w:tc>
-        <w:tc>
-          <w:tcPr>
-            <w:tcW w:type="dxa" w:w="961"/>
+            <w:tcW w:type="dxa" w:w="2348"/>
+            <w:tcMar>
+              <w:top w:type="dxa" w:w="40"/>
+              <w:left w:type="dxa" w:w="80"/>
+              <w:bottom w:type="dxa" w:w="40"/>
+              <w:right w:type="dxa" w:w="80"/>
+            </w:tcMar>
+          </w:tcPr>
+          <w:p>
+            <w:pPr>
+              <w:spacing w:line="240" w:lineRule="auto"/>
+            </w:pPr>
+            <w:r>
+              <w:rPr>
+                <w:b w:val="false"/>
+                <w:bCs w:val="false"/>
+                <w:sz w:val="20"/>
+                <w:szCs w:val="20"/>
+              </w:rPr>
+              <w:t xml:space="preserve">simple (n = 2, mean ≤ 0.9·limit)</w:t>
+            </w:r>
+          </w:p>
+        </w:tc>
+        <w:tc>
+          <w:tcPr>
+            <w:tcW w:type="dxa" w:w="953"/>
             <w:tcMar>
               <w:top w:type="dxa" w:w="40"/>
               <w:left w:type="dxa" w:w="80"/>
@@ -20285,7 +20941,7 @@
         </w:tc>
         <w:tc>
           <w:tcPr>
-            <w:tcW w:type="dxa" w:w="1775"/>
+            <w:tcW w:type="dxa" w:w="1761"/>
             <w:tcMar>
               <w:top w:type="dxa" w:w="40"/>
               <w:left w:type="dxa" w:w="80"/>
@@ -20310,7 +20966,7 @@
         </w:tc>
         <w:tc>
           <w:tcPr>
-            <w:tcW w:type="dxa" w:w="1035"/>
+            <w:tcW w:type="dxa" w:w="1027"/>
             <w:tcMar>
               <w:top w:type="dxa" w:w="40"/>
               <w:left w:type="dxa" w:w="80"/>
@@ -20335,7 +20991,7 @@
         </w:tc>
         <w:tc>
           <w:tcPr>
-            <w:tcW w:type="dxa" w:w="1035"/>
+            <w:tcW w:type="dxa" w:w="1027"/>
             <w:tcMar>
               <w:top w:type="dxa" w:w="40"/>
               <w:left w:type="dxa" w:w="80"/>
@@ -20360,7 +21016,7 @@
         </w:tc>
         <w:tc>
           <w:tcPr>
-            <w:tcW w:type="dxa" w:w="966"/>
+            <w:tcW w:type="dxa" w:w="957"/>
             <w:tcMar>
               <w:top w:type="dxa" w:w="40"/>
               <w:left w:type="dxa" w:w="80"/>
@@ -20390,7 +21046,7 @@
         </w:trPr>
         <w:tc>
           <w:tcPr>
-            <w:tcW w:type="dxa" w:w="961"/>
+            <w:tcW w:type="dxa" w:w="953"/>
             <w:tcMar>
               <w:top w:type="dxa" w:w="40"/>
               <w:left w:type="dxa" w:w="80"/>
@@ -20415,7 +21071,7 @@
         </w:tc>
         <w:tc>
           <w:tcPr>
-            <w:tcW w:type="dxa" w:w="2293"/>
+            <w:tcW w:type="dxa" w:w="2348"/>
             <w:tcMar>
               <w:top w:type="dxa" w:w="40"/>
               <w:left w:type="dxa" w:w="80"/>
@@ -20440,7 +21096,7 @@
         </w:tc>
         <w:tc>
           <w:tcPr>
-            <w:tcW w:type="dxa" w:w="961"/>
+            <w:tcW w:type="dxa" w:w="953"/>
             <w:tcMar>
               <w:top w:type="dxa" w:w="40"/>
               <w:left w:type="dxa" w:w="80"/>
@@ -20465,7 +21121,7 @@
         </w:tc>
         <w:tc>
           <w:tcPr>
-            <w:tcW w:type="dxa" w:w="1775"/>
+            <w:tcW w:type="dxa" w:w="1761"/>
             <w:tcMar>
               <w:top w:type="dxa" w:w="40"/>
               <w:left w:type="dxa" w:w="80"/>
@@ -20490,7 +21146,7 @@
         </w:tc>
         <w:tc>
           <w:tcPr>
-            <w:tcW w:type="dxa" w:w="1035"/>
+            <w:tcW w:type="dxa" w:w="1027"/>
             <w:tcMar>
               <w:top w:type="dxa" w:w="40"/>
               <w:left w:type="dxa" w:w="80"/>
@@ -20515,7 +21171,7 @@
         </w:tc>
         <w:tc>
           <w:tcPr>
-            <w:tcW w:type="dxa" w:w="1035"/>
+            <w:tcW w:type="dxa" w:w="1027"/>
             <w:tcMar>
               <w:top w:type="dxa" w:w="40"/>
               <w:left w:type="dxa" w:w="80"/>
@@ -20540,7 +21196,7 @@
         </w:tc>
         <w:tc>
           <w:tcPr>
-            <w:tcW w:type="dxa" w:w="966"/>
+            <w:tcW w:type="dxa" w:w="957"/>
             <w:tcMar>
               <w:top w:type="dxa" w:w="40"/>
               <w:left w:type="dxa" w:w="80"/>
@@ -20570,7 +21226,7 @@
         </w:trPr>
         <w:tc>
           <w:tcPr>
-            <w:tcW w:type="dxa" w:w="961"/>
+            <w:tcW w:type="dxa" w:w="953"/>
             <w:tcMar>
               <w:top w:type="dxa" w:w="40"/>
               <w:left w:type="dxa" w:w="80"/>
@@ -20595,32 +21251,32 @@
         </w:tc>
         <w:tc>
           <w:tcPr>
-            <w:tcW w:type="dxa" w:w="2293"/>
-            <w:tcMar>
-              <w:top w:type="dxa" w:w="40"/>
-              <w:left w:type="dxa" w:w="80"/>
-              <w:bottom w:type="dxa" w:w="40"/>
-              <w:right w:type="dxa" w:w="80"/>
-            </w:tcMar>
-          </w:tcPr>
-          <w:p>
-            <w:pPr>
-              <w:spacing w:line="240" w:lineRule="auto"/>
-            </w:pPr>
-            <w:r>
-              <w:rPr>
-                <w:b w:val="false"/>
-                <w:bCs w:val="false"/>
-                <w:sz w:val="20"/>
-                <w:szCs w:val="20"/>
-              </w:rPr>
-              <w:t xml:space="preserve">v0.2</w:t>
-            </w:r>
-          </w:p>
-        </w:tc>
-        <w:tc>
-          <w:tcPr>
-            <w:tcW w:type="dxa" w:w="961"/>
+            <w:tcW w:type="dxa" w:w="2348"/>
+            <w:tcMar>
+              <w:top w:type="dxa" w:w="40"/>
+              <w:left w:type="dxa" w:w="80"/>
+              <w:bottom w:type="dxa" w:w="40"/>
+              <w:right w:type="dxa" w:w="80"/>
+            </w:tcMar>
+          </w:tcPr>
+          <w:p>
+            <w:pPr>
+              <w:spacing w:line="240" w:lineRule="auto"/>
+            </w:pPr>
+            <w:r>
+              <w:rPr>
+                <w:b w:val="false"/>
+                <w:bCs w:val="false"/>
+                <w:sz w:val="20"/>
+                <w:szCs w:val="20"/>
+              </w:rPr>
+              <w:t xml:space="preserve">simple</w:t>
+            </w:r>
+          </w:p>
+        </w:tc>
+        <w:tc>
+          <w:tcPr>
+            <w:tcW w:type="dxa" w:w="953"/>
             <w:tcMar>
               <w:top w:type="dxa" w:w="40"/>
               <w:left w:type="dxa" w:w="80"/>
@@ -20645,7 +21301,7 @@
         </w:tc>
         <w:tc>
           <w:tcPr>
-            <w:tcW w:type="dxa" w:w="1775"/>
+            <w:tcW w:type="dxa" w:w="1761"/>
             <w:tcMar>
               <w:top w:type="dxa" w:w="40"/>
               <w:left w:type="dxa" w:w="80"/>
@@ -20670,7 +21326,7 @@
         </w:tc>
         <w:tc>
           <w:tcPr>
-            <w:tcW w:type="dxa" w:w="1035"/>
+            <w:tcW w:type="dxa" w:w="1027"/>
             <w:tcMar>
               <w:top w:type="dxa" w:w="40"/>
               <w:left w:type="dxa" w:w="80"/>
@@ -20695,7 +21351,7 @@
         </w:tc>
         <w:tc>
           <w:tcPr>
-            <w:tcW w:type="dxa" w:w="1035"/>
+            <w:tcW w:type="dxa" w:w="1027"/>
             <w:tcMar>
               <w:top w:type="dxa" w:w="40"/>
               <w:left w:type="dxa" w:w="80"/>
@@ -20720,7 +21376,7 @@
         </w:tc>
         <w:tc>
           <w:tcPr>
-            <w:tcW w:type="dxa" w:w="966"/>
+            <w:tcW w:type="dxa" w:w="957"/>
             <w:tcMar>
               <w:top w:type="dxa" w:w="40"/>
               <w:left w:type="dxa" w:w="80"/>
@@ -20750,7 +21406,7 @@
         </w:trPr>
         <w:tc>
           <w:tcPr>
-            <w:tcW w:type="dxa" w:w="961"/>
+            <w:tcW w:type="dxa" w:w="953"/>
             <w:tcMar>
               <w:top w:type="dxa" w:w="40"/>
               <w:left w:type="dxa" w:w="80"/>
@@ -20775,7 +21431,7 @@
         </w:tc>
         <w:tc>
           <w:tcPr>
-            <w:tcW w:type="dxa" w:w="2293"/>
+            <w:tcW w:type="dxa" w:w="2348"/>
             <w:tcMar>
               <w:top w:type="dxa" w:w="40"/>
               <w:left w:type="dxa" w:w="80"/>
@@ -20800,7 +21456,7 @@
         </w:tc>
         <w:tc>
           <w:tcPr>
-            <w:tcW w:type="dxa" w:w="961"/>
+            <w:tcW w:type="dxa" w:w="953"/>
             <w:tcMar>
               <w:top w:type="dxa" w:w="40"/>
               <w:left w:type="dxa" w:w="80"/>
@@ -20825,7 +21481,7 @@
         </w:tc>
         <w:tc>
           <w:tcPr>
-            <w:tcW w:type="dxa" w:w="1775"/>
+            <w:tcW w:type="dxa" w:w="1761"/>
             <w:tcMar>
               <w:top w:type="dxa" w:w="40"/>
               <w:left w:type="dxa" w:w="80"/>
@@ -20850,7 +21506,7 @@
         </w:tc>
         <w:tc>
           <w:tcPr>
-            <w:tcW w:type="dxa" w:w="1035"/>
+            <w:tcW w:type="dxa" w:w="1027"/>
             <w:tcMar>
               <w:top w:type="dxa" w:w="40"/>
               <w:left w:type="dxa" w:w="80"/>
@@ -20875,7 +21531,7 @@
         </w:tc>
         <w:tc>
           <w:tcPr>
-            <w:tcW w:type="dxa" w:w="1035"/>
+            <w:tcW w:type="dxa" w:w="1027"/>
             <w:tcMar>
               <w:top w:type="dxa" w:w="40"/>
               <w:left w:type="dxa" w:w="80"/>
@@ -20900,7 +21556,7 @@
         </w:tc>
         <w:tc>
           <w:tcPr>
-            <w:tcW w:type="dxa" w:w="966"/>
+            <w:tcW w:type="dxa" w:w="957"/>
             <w:tcMar>
               <w:top w:type="dxa" w:w="40"/>
               <w:left w:type="dxa" w:w="80"/>
@@ -20930,7 +21586,7 @@
         </w:trPr>
         <w:tc>
           <w:tcPr>
-            <w:tcW w:type="dxa" w:w="961"/>
+            <w:tcW w:type="dxa" w:w="953"/>
             <w:tcMar>
               <w:top w:type="dxa" w:w="40"/>
               <w:left w:type="dxa" w:w="80"/>
@@ -20955,32 +21611,32 @@
         </w:tc>
         <w:tc>
           <w:tcPr>
-            <w:tcW w:type="dxa" w:w="2293"/>
-            <w:tcMar>
-              <w:top w:type="dxa" w:w="40"/>
-              <w:left w:type="dxa" w:w="80"/>
-              <w:bottom w:type="dxa" w:w="40"/>
-              <w:right w:type="dxa" w:w="80"/>
-            </w:tcMar>
-          </w:tcPr>
-          <w:p>
-            <w:pPr>
-              <w:spacing w:line="240" w:lineRule="auto"/>
-            </w:pPr>
-            <w:r>
-              <w:rPr>
-                <w:b w:val="false"/>
-                <w:bCs w:val="false"/>
-                <w:sz w:val="20"/>
-                <w:szCs w:val="20"/>
-              </w:rPr>
-              <w:t xml:space="preserve">v0.2</w:t>
-            </w:r>
-          </w:p>
-        </w:tc>
-        <w:tc>
-          <w:tcPr>
-            <w:tcW w:type="dxa" w:w="961"/>
+            <w:tcW w:type="dxa" w:w="2348"/>
+            <w:tcMar>
+              <w:top w:type="dxa" w:w="40"/>
+              <w:left w:type="dxa" w:w="80"/>
+              <w:bottom w:type="dxa" w:w="40"/>
+              <w:right w:type="dxa" w:w="80"/>
+            </w:tcMar>
+          </w:tcPr>
+          <w:p>
+            <w:pPr>
+              <w:spacing w:line="240" w:lineRule="auto"/>
+            </w:pPr>
+            <w:r>
+              <w:rPr>
+                <w:b w:val="false"/>
+                <w:bCs w:val="false"/>
+                <w:sz w:val="20"/>
+                <w:szCs w:val="20"/>
+              </w:rPr>
+              <w:t xml:space="preserve">simple</w:t>
+            </w:r>
+          </w:p>
+        </w:tc>
+        <w:tc>
+          <w:tcPr>
+            <w:tcW w:type="dxa" w:w="953"/>
             <w:tcMar>
               <w:top w:type="dxa" w:w="40"/>
               <w:left w:type="dxa" w:w="80"/>
@@ -21005,7 +21661,7 @@
         </w:tc>
         <w:tc>
           <w:tcPr>
-            <w:tcW w:type="dxa" w:w="1775"/>
+            <w:tcW w:type="dxa" w:w="1761"/>
             <w:tcMar>
               <w:top w:type="dxa" w:w="40"/>
               <w:left w:type="dxa" w:w="80"/>
@@ -21030,7 +21686,7 @@
         </w:tc>
         <w:tc>
           <w:tcPr>
-            <w:tcW w:type="dxa" w:w="1035"/>
+            <w:tcW w:type="dxa" w:w="1027"/>
             <w:tcMar>
               <w:top w:type="dxa" w:w="40"/>
               <w:left w:type="dxa" w:w="80"/>
@@ -21055,7 +21711,7 @@
         </w:tc>
         <w:tc>
           <w:tcPr>
-            <w:tcW w:type="dxa" w:w="1035"/>
+            <w:tcW w:type="dxa" w:w="1027"/>
             <w:tcMar>
               <w:top w:type="dxa" w:w="40"/>
               <w:left w:type="dxa" w:w="80"/>
@@ -21080,7 +21736,7 @@
         </w:tc>
         <w:tc>
           <w:tcPr>
-            <w:tcW w:type="dxa" w:w="966"/>
+            <w:tcW w:type="dxa" w:w="957"/>
             <w:tcMar>
               <w:top w:type="dxa" w:w="40"/>
               <w:left w:type="dxa" w:w="80"/>
@@ -21110,7 +21766,7 @@
         </w:trPr>
         <w:tc>
           <w:tcPr>
-            <w:tcW w:type="dxa" w:w="961"/>
+            <w:tcW w:type="dxa" w:w="953"/>
             <w:tcBorders>
               <w:bottom w:val="single" w:color="000000" w:sz="8"/>
             </w:tcBorders>
@@ -21138,7 +21794,7 @@
         </w:tc>
         <w:tc>
           <w:tcPr>
-            <w:tcW w:type="dxa" w:w="2293"/>
+            <w:tcW w:type="dxa" w:w="2348"/>
             <w:tcBorders>
               <w:bottom w:val="single" w:color="000000" w:sz="8"/>
             </w:tcBorders>
@@ -21166,7 +21822,7 @@
         </w:tc>
         <w:tc>
           <w:tcPr>
-            <w:tcW w:type="dxa" w:w="961"/>
+            <w:tcW w:type="dxa" w:w="953"/>
             <w:tcBorders>
               <w:bottom w:val="single" w:color="000000" w:sz="8"/>
             </w:tcBorders>
@@ -21194,7 +21850,7 @@
         </w:tc>
         <w:tc>
           <w:tcPr>
-            <w:tcW w:type="dxa" w:w="1775"/>
+            <w:tcW w:type="dxa" w:w="1761"/>
             <w:tcBorders>
               <w:bottom w:val="single" w:color="000000" w:sz="8"/>
             </w:tcBorders>
@@ -21222,7 +21878,7 @@
         </w:tc>
         <w:tc>
           <w:tcPr>
-            <w:tcW w:type="dxa" w:w="1035"/>
+            <w:tcW w:type="dxa" w:w="1027"/>
             <w:tcBorders>
               <w:bottom w:val="single" w:color="000000" w:sz="8"/>
             </w:tcBorders>
@@ -21250,7 +21906,7 @@
         </w:tc>
         <w:tc>
           <w:tcPr>
-            <w:tcW w:type="dxa" w:w="1035"/>
+            <w:tcW w:type="dxa" w:w="1027"/>
             <w:tcBorders>
               <w:bottom w:val="single" w:color="000000" w:sz="8"/>
             </w:tcBorders>
@@ -21278,7 +21934,7 @@
         </w:tc>
         <w:tc>
           <w:tcPr>
-            <w:tcW w:type="dxa" w:w="966"/>
+            <w:tcW w:type="dxa" w:w="957"/>
             <w:tcBorders>
               <w:bottom w:val="single" w:color="000000" w:sz="8"/>
             </w:tcBorders>
@@ -21357,6 +22013,645 @@
       </w:pPr>
       <w:r>
         <w:t xml:space="preserve">A 20% dose reduction gave 83% compliance.</w:t>
+      </w:r>
+    </w:p>
+    <w:p>
+      <w:pPr>
+        <w:keepNext w:val="false"/>
+        <w:spacing w:line="480" w:lineRule="auto"/>
+        <w:jc w:val="both"/>
+      </w:pPr>
+      <w:r>
+        <w:rPr>
+          <w:b/>
+          <w:bCs/>
+        </w:rPr>
+        <w:t xml:space="preserve">Out-of-study accuracy of the endpoint models (Table S13).</w:t>
+      </w:r>
+      <w:r>
+        <w:t xml:space="preserve"> The design layer uses four RF models: Cr(VI) and total Cr, as uptake and as effluent concentration. The total-Cr models are trained only on rows with a total-Cr measurement, from about 18 Class A/B studies per corpus. Under leave-one-study-out (10 corpora), the R² on the log scale was:</w:t>
+      </w:r>
+    </w:p>
+    <w:tbl>
+      <w:tblPr>
+        <w:tblW w:type="dxa" w:w="9026"/>
+        <w:tblBorders>
+          <w:top w:val="single" w:color="000000" w:sz="8"/>
+          <w:left w:val="none" w:color="FFFFFF" w:sz="0"/>
+          <w:bottom w:val="single" w:color="000000" w:sz="8"/>
+          <w:right w:val="none" w:color="FFFFFF" w:sz="0"/>
+          <w:insideH w:val="none" w:color="FFFFFF" w:sz="0"/>
+          <w:insideV w:val="none" w:color="FFFFFF" w:sz="0"/>
+        </w:tblBorders>
+      </w:tblPr>
+      <w:tblGrid>
+        <w:gridCol w:w="1725"/>
+        <w:gridCol w:w="1991"/>
+        <w:gridCol w:w="3052"/>
+        <w:gridCol w:w="2258"/>
+      </w:tblGrid>
+      <w:tr>
+        <w:trPr>
+          <w:tblHeader/>
+        </w:trPr>
+        <w:tc>
+          <w:tcPr>
+            <w:tcW w:type="dxa" w:w="1725"/>
+            <w:tcBorders>
+              <w:top w:val="single" w:color="000000" w:sz="8"/>
+              <w:bottom w:val="single" w:color="000000" w:sz="8"/>
+            </w:tcBorders>
+            <w:tcMar>
+              <w:top w:type="dxa" w:w="40"/>
+              <w:left w:type="dxa" w:w="80"/>
+              <w:bottom w:type="dxa" w:w="40"/>
+              <w:right w:type="dxa" w:w="80"/>
+            </w:tcMar>
+          </w:tcPr>
+          <w:p>
+            <w:pPr>
+              <w:spacing w:line="240" w:lineRule="auto"/>
+            </w:pPr>
+            <w:r>
+              <w:rPr>
+                <w:b/>
+                <w:bCs/>
+                <w:sz w:val="20"/>
+                <w:szCs w:val="20"/>
+              </w:rPr>
+              <w:t xml:space="preserve">Endpoint</w:t>
+            </w:r>
+          </w:p>
+        </w:tc>
+        <w:tc>
+          <w:tcPr>
+            <w:tcW w:type="dxa" w:w="1991"/>
+            <w:tcBorders>
+              <w:top w:val="single" w:color="000000" w:sz="8"/>
+              <w:bottom w:val="single" w:color="000000" w:sz="8"/>
+            </w:tcBorders>
+            <w:tcMar>
+              <w:top w:type="dxa" w:w="40"/>
+              <w:left w:type="dxa" w:w="80"/>
+              <w:bottom w:type="dxa" w:w="40"/>
+              <w:right w:type="dxa" w:w="80"/>
+            </w:tcMar>
+          </w:tcPr>
+          <w:p>
+            <w:pPr>
+              <w:spacing w:line="240" w:lineRule="auto"/>
+            </w:pPr>
+            <w:r>
+              <w:rPr>
+                <w:b/>
+                <w:bCs/>
+                <w:sz w:val="20"/>
+                <w:szCs w:val="20"/>
+              </w:rPr>
+              <w:t xml:space="preserve">LOSO R² (log₁₀)</w:t>
+            </w:r>
+          </w:p>
+        </w:tc>
+        <w:tc>
+          <w:tcPr>
+            <w:tcW w:type="dxa" w:w="3052"/>
+            <w:tcBorders>
+              <w:top w:val="single" w:color="000000" w:sz="8"/>
+              <w:bottom w:val="single" w:color="000000" w:sz="8"/>
+            </w:tcBorders>
+            <w:tcMar>
+              <w:top w:type="dxa" w:w="40"/>
+              <w:left w:type="dxa" w:w="80"/>
+              <w:bottom w:type="dxa" w:w="40"/>
+              <w:right w:type="dxa" w:w="80"/>
+            </w:tcMar>
+          </w:tcPr>
+          <w:p>
+            <w:pPr>
+              <w:spacing w:line="240" w:lineRule="auto"/>
+            </w:pPr>
+            <w:r>
+              <w:rPr>
+                <w:b/>
+                <w:bCs/>
+                <w:sz w:val="20"/>
+                <w:szCs w:val="20"/>
+              </w:rPr>
+              <w:t xml:space="preserve">Random-split R² (log₁₀)</w:t>
+            </w:r>
+          </w:p>
+        </w:tc>
+        <w:tc>
+          <w:tcPr>
+            <w:tcW w:type="dxa" w:w="2258"/>
+            <w:tcBorders>
+              <w:top w:val="single" w:color="000000" w:sz="8"/>
+              <w:bottom w:val="single" w:color="000000" w:sz="8"/>
+            </w:tcBorders>
+            <w:tcMar>
+              <w:top w:type="dxa" w:w="40"/>
+              <w:left w:type="dxa" w:w="80"/>
+              <w:bottom w:type="dxa" w:w="40"/>
+              <w:right w:type="dxa" w:w="80"/>
+            </w:tcMar>
+          </w:tcPr>
+          <w:p>
+            <w:pPr>
+              <w:spacing w:line="240" w:lineRule="auto"/>
+            </w:pPr>
+            <w:r>
+              <w:rPr>
+                <w:b/>
+                <w:bCs/>
+                <w:sz w:val="20"/>
+                <w:szCs w:val="20"/>
+              </w:rPr>
+              <w:t xml:space="preserve">LOSO RMSE (log₁₀)</w:t>
+            </w:r>
+          </w:p>
+        </w:tc>
+      </w:tr>
+      <w:tr>
+        <w:trPr>
+          <w:tblHeader w:val="false"/>
+        </w:trPr>
+        <w:tc>
+          <w:tcPr>
+            <w:tcW w:type="dxa" w:w="1725"/>
+            <w:tcMar>
+              <w:top w:type="dxa" w:w="40"/>
+              <w:left w:type="dxa" w:w="80"/>
+              <w:bottom w:type="dxa" w:w="40"/>
+              <w:right w:type="dxa" w:w="80"/>
+            </w:tcMar>
+          </w:tcPr>
+          <w:p>
+            <w:pPr>
+              <w:spacing w:line="240" w:lineRule="auto"/>
+            </w:pPr>
+            <w:r>
+              <w:rPr>
+                <w:b w:val="false"/>
+                <w:bCs w:val="false"/>
+                <w:sz w:val="20"/>
+                <w:szCs w:val="20"/>
+              </w:rPr>
+              <w:t xml:space="preserve">C</w:t>
+            </w:r>
+            <w:r>
+              <w:rPr>
+                <w:b w:val="false"/>
+                <w:bCs w:val="false"/>
+                <w:sz w:val="20"/>
+                <w:szCs w:val="20"/>
+                <w:vertAlign w:val="subscript"/>
+              </w:rPr>
+              <w:t xml:space="preserve">e,VI</w:t>
+            </w:r>
+          </w:p>
+        </w:tc>
+        <w:tc>
+          <w:tcPr>
+            <w:tcW w:type="dxa" w:w="1991"/>
+            <w:tcMar>
+              <w:top w:type="dxa" w:w="40"/>
+              <w:left w:type="dxa" w:w="80"/>
+              <w:bottom w:type="dxa" w:w="40"/>
+              <w:right w:type="dxa" w:w="80"/>
+            </w:tcMar>
+          </w:tcPr>
+          <w:p>
+            <w:pPr>
+              <w:spacing w:line="240" w:lineRule="auto"/>
+            </w:pPr>
+            <w:r>
+              <w:rPr>
+                <w:b w:val="false"/>
+                <w:bCs w:val="false"/>
+                <w:sz w:val="20"/>
+                <w:szCs w:val="20"/>
+              </w:rPr>
+              <w:t xml:space="preserve">0.74 ± 0.06</w:t>
+            </w:r>
+          </w:p>
+        </w:tc>
+        <w:tc>
+          <w:tcPr>
+            <w:tcW w:type="dxa" w:w="3052"/>
+            <w:tcMar>
+              <w:top w:type="dxa" w:w="40"/>
+              <w:left w:type="dxa" w:w="80"/>
+              <w:bottom w:type="dxa" w:w="40"/>
+              <w:right w:type="dxa" w:w="80"/>
+            </w:tcMar>
+          </w:tcPr>
+          <w:p>
+            <w:pPr>
+              <w:spacing w:line="240" w:lineRule="auto"/>
+            </w:pPr>
+            <w:r>
+              <w:rPr>
+                <w:b w:val="false"/>
+                <w:bCs w:val="false"/>
+                <w:sz w:val="20"/>
+                <w:szCs w:val="20"/>
+              </w:rPr>
+              <w:t xml:space="preserve">0.94</w:t>
+            </w:r>
+          </w:p>
+        </w:tc>
+        <w:tc>
+          <w:tcPr>
+            <w:tcW w:type="dxa" w:w="2258"/>
+            <w:tcMar>
+              <w:top w:type="dxa" w:w="40"/>
+              <w:left w:type="dxa" w:w="80"/>
+              <w:bottom w:type="dxa" w:w="40"/>
+              <w:right w:type="dxa" w:w="80"/>
+            </w:tcMar>
+          </w:tcPr>
+          <w:p>
+            <w:pPr>
+              <w:spacing w:line="240" w:lineRule="auto"/>
+            </w:pPr>
+            <w:r>
+              <w:rPr>
+                <w:b w:val="false"/>
+                <w:bCs w:val="false"/>
+                <w:sz w:val="20"/>
+                <w:szCs w:val="20"/>
+              </w:rPr>
+              <w:t xml:space="preserve">0.49</w:t>
+            </w:r>
+          </w:p>
+        </w:tc>
+      </w:tr>
+      <w:tr>
+        <w:trPr>
+          <w:tblHeader w:val="false"/>
+        </w:trPr>
+        <w:tc>
+          <w:tcPr>
+            <w:tcW w:type="dxa" w:w="1725"/>
+            <w:tcMar>
+              <w:top w:type="dxa" w:w="40"/>
+              <w:left w:type="dxa" w:w="80"/>
+              <w:bottom w:type="dxa" w:w="40"/>
+              <w:right w:type="dxa" w:w="80"/>
+            </w:tcMar>
+          </w:tcPr>
+          <w:p>
+            <w:pPr>
+              <w:spacing w:line="240" w:lineRule="auto"/>
+            </w:pPr>
+            <w:r>
+              <w:rPr>
+                <w:b w:val="false"/>
+                <w:bCs w:val="false"/>
+                <w:sz w:val="20"/>
+                <w:szCs w:val="20"/>
+              </w:rPr>
+              <w:t xml:space="preserve">C</w:t>
+            </w:r>
+            <w:r>
+              <w:rPr>
+                <w:b w:val="false"/>
+                <w:bCs w:val="false"/>
+                <w:sz w:val="20"/>
+                <w:szCs w:val="20"/>
+                <w:vertAlign w:val="subscript"/>
+              </w:rPr>
+              <w:t xml:space="preserve">e,tot</w:t>
+            </w:r>
+          </w:p>
+        </w:tc>
+        <w:tc>
+          <w:tcPr>
+            <w:tcW w:type="dxa" w:w="1991"/>
+            <w:tcMar>
+              <w:top w:type="dxa" w:w="40"/>
+              <w:left w:type="dxa" w:w="80"/>
+              <w:bottom w:type="dxa" w:w="40"/>
+              <w:right w:type="dxa" w:w="80"/>
+            </w:tcMar>
+          </w:tcPr>
+          <w:p>
+            <w:pPr>
+              <w:spacing w:line="240" w:lineRule="auto"/>
+            </w:pPr>
+            <w:r>
+              <w:rPr>
+                <w:b w:val="false"/>
+                <w:bCs w:val="false"/>
+                <w:sz w:val="20"/>
+                <w:szCs w:val="20"/>
+              </w:rPr>
+              <w:t xml:space="preserve">0.65 ± 0.09</w:t>
+            </w:r>
+          </w:p>
+        </w:tc>
+        <w:tc>
+          <w:tcPr>
+            <w:tcW w:type="dxa" w:w="3052"/>
+            <w:tcMar>
+              <w:top w:type="dxa" w:w="40"/>
+              <w:left w:type="dxa" w:w="80"/>
+              <w:bottom w:type="dxa" w:w="40"/>
+              <w:right w:type="dxa" w:w="80"/>
+            </w:tcMar>
+          </w:tcPr>
+          <w:p>
+            <w:pPr>
+              <w:spacing w:line="240" w:lineRule="auto"/>
+            </w:pPr>
+            <w:r>
+              <w:rPr>
+                <w:b w:val="false"/>
+                <w:bCs w:val="false"/>
+                <w:sz w:val="20"/>
+                <w:szCs w:val="20"/>
+              </w:rPr>
+              <w:t xml:space="preserve">0.91</w:t>
+            </w:r>
+          </w:p>
+        </w:tc>
+        <w:tc>
+          <w:tcPr>
+            <w:tcW w:type="dxa" w:w="2258"/>
+            <w:tcMar>
+              <w:top w:type="dxa" w:w="40"/>
+              <w:left w:type="dxa" w:w="80"/>
+              <w:bottom w:type="dxa" w:w="40"/>
+              <w:right w:type="dxa" w:w="80"/>
+            </w:tcMar>
+          </w:tcPr>
+          <w:p>
+            <w:pPr>
+              <w:spacing w:line="240" w:lineRule="auto"/>
+            </w:pPr>
+            <w:r>
+              <w:rPr>
+                <w:b w:val="false"/>
+                <w:bCs w:val="false"/>
+                <w:sz w:val="20"/>
+                <w:szCs w:val="20"/>
+              </w:rPr>
+              <w:t xml:space="preserve">0.37</w:t>
+            </w:r>
+          </w:p>
+        </w:tc>
+      </w:tr>
+      <w:tr>
+        <w:trPr>
+          <w:tblHeader w:val="false"/>
+        </w:trPr>
+        <w:tc>
+          <w:tcPr>
+            <w:tcW w:type="dxa" w:w="1725"/>
+            <w:tcMar>
+              <w:top w:type="dxa" w:w="40"/>
+              <w:left w:type="dxa" w:w="80"/>
+              <w:bottom w:type="dxa" w:w="40"/>
+              <w:right w:type="dxa" w:w="80"/>
+            </w:tcMar>
+          </w:tcPr>
+          <w:p>
+            <w:pPr>
+              <w:spacing w:line="240" w:lineRule="auto"/>
+            </w:pPr>
+            <w:r>
+              <w:rPr>
+                <w:b w:val="false"/>
+                <w:bCs w:val="false"/>
+                <w:sz w:val="20"/>
+                <w:szCs w:val="20"/>
+              </w:rPr>
+              <w:t xml:space="preserve">q</w:t>
+            </w:r>
+            <w:r>
+              <w:rPr>
+                <w:b w:val="false"/>
+                <w:bCs w:val="false"/>
+                <w:sz w:val="20"/>
+                <w:szCs w:val="20"/>
+                <w:vertAlign w:val="subscript"/>
+              </w:rPr>
+              <w:t xml:space="preserve">app,VI</w:t>
+            </w:r>
+          </w:p>
+        </w:tc>
+        <w:tc>
+          <w:tcPr>
+            <w:tcW w:type="dxa" w:w="1991"/>
+            <w:tcMar>
+              <w:top w:type="dxa" w:w="40"/>
+              <w:left w:type="dxa" w:w="80"/>
+              <w:bottom w:type="dxa" w:w="40"/>
+              <w:right w:type="dxa" w:w="80"/>
+            </w:tcMar>
+          </w:tcPr>
+          <w:p>
+            <w:pPr>
+              <w:spacing w:line="240" w:lineRule="auto"/>
+            </w:pPr>
+            <w:r>
+              <w:rPr>
+                <w:b w:val="false"/>
+                <w:bCs w:val="false"/>
+                <w:sz w:val="20"/>
+                <w:szCs w:val="20"/>
+              </w:rPr>
+              <w:t xml:space="preserve">0.39 ± 0.16</w:t>
+            </w:r>
+          </w:p>
+        </w:tc>
+        <w:tc>
+          <w:tcPr>
+            <w:tcW w:type="dxa" w:w="3052"/>
+            <w:tcMar>
+              <w:top w:type="dxa" w:w="40"/>
+              <w:left w:type="dxa" w:w="80"/>
+              <w:bottom w:type="dxa" w:w="40"/>
+              <w:right w:type="dxa" w:w="80"/>
+            </w:tcMar>
+          </w:tcPr>
+          <w:p>
+            <w:pPr>
+              <w:spacing w:line="240" w:lineRule="auto"/>
+            </w:pPr>
+            <w:r>
+              <w:rPr>
+                <w:b w:val="false"/>
+                <w:bCs w:val="false"/>
+                <w:sz w:val="20"/>
+                <w:szCs w:val="20"/>
+              </w:rPr>
+              <w:t xml:space="preserve">0.77</w:t>
+            </w:r>
+          </w:p>
+        </w:tc>
+        <w:tc>
+          <w:tcPr>
+            <w:tcW w:type="dxa" w:w="2258"/>
+            <w:tcMar>
+              <w:top w:type="dxa" w:w="40"/>
+              <w:left w:type="dxa" w:w="80"/>
+              <w:bottom w:type="dxa" w:w="40"/>
+              <w:right w:type="dxa" w:w="80"/>
+            </w:tcMar>
+          </w:tcPr>
+          <w:p>
+            <w:pPr>
+              <w:spacing w:line="240" w:lineRule="auto"/>
+            </w:pPr>
+            <w:r>
+              <w:rPr>
+                <w:b w:val="false"/>
+                <w:bCs w:val="false"/>
+                <w:sz w:val="20"/>
+                <w:szCs w:val="20"/>
+              </w:rPr>
+              <w:t xml:space="preserve">0.51</w:t>
+            </w:r>
+          </w:p>
+        </w:tc>
+      </w:tr>
+      <w:tr>
+        <w:trPr>
+          <w:tblHeader w:val="false"/>
+        </w:trPr>
+        <w:tc>
+          <w:tcPr>
+            <w:tcW w:type="dxa" w:w="1725"/>
+            <w:tcBorders>
+              <w:bottom w:val="single" w:color="000000" w:sz="8"/>
+            </w:tcBorders>
+            <w:tcMar>
+              <w:top w:type="dxa" w:w="40"/>
+              <w:left w:type="dxa" w:w="80"/>
+              <w:bottom w:type="dxa" w:w="40"/>
+              <w:right w:type="dxa" w:w="80"/>
+            </w:tcMar>
+          </w:tcPr>
+          <w:p>
+            <w:pPr>
+              <w:spacing w:line="240" w:lineRule="auto"/>
+            </w:pPr>
+            <w:r>
+              <w:rPr>
+                <w:b w:val="false"/>
+                <w:bCs w:val="false"/>
+                <w:sz w:val="20"/>
+                <w:szCs w:val="20"/>
+              </w:rPr>
+              <w:t xml:space="preserve">q</w:t>
+            </w:r>
+            <w:r>
+              <w:rPr>
+                <w:b w:val="false"/>
+                <w:bCs w:val="false"/>
+                <w:sz w:val="20"/>
+                <w:szCs w:val="20"/>
+                <w:vertAlign w:val="subscript"/>
+              </w:rPr>
+              <w:t xml:space="preserve">tot,aq</w:t>
+            </w:r>
+          </w:p>
+        </w:tc>
+        <w:tc>
+          <w:tcPr>
+            <w:tcW w:type="dxa" w:w="1991"/>
+            <w:tcBorders>
+              <w:bottom w:val="single" w:color="000000" w:sz="8"/>
+            </w:tcBorders>
+            <w:tcMar>
+              <w:top w:type="dxa" w:w="40"/>
+              <w:left w:type="dxa" w:w="80"/>
+              <w:bottom w:type="dxa" w:w="40"/>
+              <w:right w:type="dxa" w:w="80"/>
+            </w:tcMar>
+          </w:tcPr>
+          <w:p>
+            <w:pPr>
+              <w:spacing w:line="240" w:lineRule="auto"/>
+            </w:pPr>
+            <w:r>
+              <w:rPr>
+                <w:b w:val="false"/>
+                <w:bCs w:val="false"/>
+                <w:sz w:val="20"/>
+                <w:szCs w:val="20"/>
+              </w:rPr>
+              <w:t xml:space="preserve">0.42 ± 0.17</w:t>
+            </w:r>
+          </w:p>
+        </w:tc>
+        <w:tc>
+          <w:tcPr>
+            <w:tcW w:type="dxa" w:w="3052"/>
+            <w:tcBorders>
+              <w:bottom w:val="single" w:color="000000" w:sz="8"/>
+            </w:tcBorders>
+            <w:tcMar>
+              <w:top w:type="dxa" w:w="40"/>
+              <w:left w:type="dxa" w:w="80"/>
+              <w:bottom w:type="dxa" w:w="40"/>
+              <w:right w:type="dxa" w:w="80"/>
+            </w:tcMar>
+          </w:tcPr>
+          <w:p>
+            <w:pPr>
+              <w:spacing w:line="240" w:lineRule="auto"/>
+            </w:pPr>
+            <w:r>
+              <w:rPr>
+                <w:b w:val="false"/>
+                <w:bCs w:val="false"/>
+                <w:sz w:val="20"/>
+                <w:szCs w:val="20"/>
+              </w:rPr>
+              <w:t xml:space="preserve">0.75</w:t>
+            </w:r>
+          </w:p>
+        </w:tc>
+        <w:tc>
+          <w:tcPr>
+            <w:tcW w:type="dxa" w:w="2258"/>
+            <w:tcBorders>
+              <w:bottom w:val="single" w:color="000000" w:sz="8"/>
+            </w:tcBorders>
+            <w:tcMar>
+              <w:top w:type="dxa" w:w="40"/>
+              <w:left w:type="dxa" w:w="80"/>
+              <w:bottom w:type="dxa" w:w="40"/>
+              <w:right w:type="dxa" w:w="80"/>
+            </w:tcMar>
+          </w:tcPr>
+          <w:p>
+            <w:pPr>
+              <w:spacing w:line="240" w:lineRule="auto"/>
+            </w:pPr>
+            <w:r>
+              <w:rPr>
+                <w:b w:val="false"/>
+                <w:bCs w:val="false"/>
+                <w:sz w:val="20"/>
+                <w:szCs w:val="20"/>
+              </w:rPr>
+              <w:t xml:space="preserve">0.52</w:t>
+            </w:r>
+          </w:p>
+        </w:tc>
+      </w:tr>
+    </w:tbl>
+    <w:p>
+      <w:pPr>
+        <w:keepNext w:val="false"/>
+        <w:spacing w:before="200" w:line="480" w:lineRule="auto"/>
+        <w:jc w:val="both"/>
+      </w:pPr>
+      <w:r>
+        <w:t xml:space="preserve">R² on the log scale weights low concentrations, which matter for compliance, more than the linear-scale R² of Table 5 (linear-scale LOSO R² here: 0.87, 0.85, 0.56 and 0.52). The total-Cr models are less accurate than the Cr(VI) models, as expected from fewer training studies, and both lose about 0.2–0.4 in R² between random and study-level validation. Their study-level intervals are reported in Table 6.</w:t>
       </w:r>
     </w:p>
     <w:p>
@@ -23641,6 +24936,54 @@
     </w:p>
     <w:p>
       <w:pPr>
+        <w:pStyle w:val="ListParagraph"/>
+        <w:numPr>
+          <w:ilvl w:val="0"/>
+          <w:numId w:val="2"/>
+        </w:numPr>
+        <w:spacing w:line="480" w:lineRule="auto"/>
+      </w:pPr>
+      <w:r>
+        <w:t xml:space="preserve">The 95th percentile of true residual total Cr at the accepted designs was 0.08–1.38 mg L⁻¹ across materials, below the 2 mg L⁻¹ limit.</w:t>
+      </w:r>
+    </w:p>
+    <w:p>
+      <w:pPr>
+        <w:keepNext w:val="false"/>
+        <w:spacing w:line="480" w:lineRule="auto"/>
+        <w:jc w:val="both"/>
+      </w:pPr>
+      <w:r>
+        <w:rPr>
+          <w:b/>
+          <w:bCs/>
+        </w:rPr>
+        <w:t xml:space="preserve">Capacity level.</w:t>
+      </w:r>
+      <w:r>
+        <w:t xml:space="preserve"> A conventional isotherm fit uses neither ionic strength nor the pH basis, so unreported solution chemistry does not change the fitted q</w:t>
+      </w:r>
+      <w:r>
+        <w:rPr>
+          <w:vertAlign w:val="subscript"/>
+        </w:rPr>
+        <w:t xml:space="preserve">max</w:t>
+      </w:r>
+      <w:r>
+        <w:t xml:space="preserve"> itself. It changes what q</w:t>
+      </w:r>
+      <w:r>
+        <w:rPr>
+          <w:vertAlign w:val="subscript"/>
+        </w:rPr>
+        <w:t xml:space="preserve">max</w:t>
+      </w:r>
+      <w:r>
+        <w:t xml:space="preserve"> means: the inferred reduction share and the speciation-based affinity (mechanistic level below).</w:t>
+      </w:r>
+    </w:p>
+    <w:p>
+      <w:pPr>
         <w:keepNext w:val="false"/>
         <w:spacing w:line="480" w:lineRule="auto"/>
         <w:jc w:val="both"/>
@@ -23777,7 +25120,7 @@
         <w:t xml:space="preserve">Not done.</w:t>
       </w:r>
       <w:r>
-        <w:t xml:space="preserve"> No published experimental observation was analysed in this revision. The seed dataset (Ramirez et al., 2020; Data in Brief 29, 105292) and the systematic search were blocked: the hosts required to retrieve articles and supplementary files (PubMed Central, ScienceDirect, Crossref, Europe PMC, Zenodo, Mendeley Data, Figshare) were not reachable from the computational environment. No values were transcribed from memory or estimated.</w:t>
+        <w:t xml:space="preserve"> No published experimental observation was analysed. The seed dataset (Ramirez et al., 2020; Data in Brief 29, 105292) is openly available through PubMed Central (PMC7044665) with its raw isotherm and kinetic files as supplementary material. It reports Cr(VI) removal by a ZnCl₂-activated teakwood-sawdust carbon; its interpretation is in a companion article (J. Environ. Chem. Eng. 8, 103702; doi:10.1016/j.jece.2020.103702). It measures residual Cr(VI) only and is therefore a Class C benchmark: it can test whether CASSIA processes genuine observations, not whether it recovers the true Cr(VI)/Cr(III) distribution. Neither this dataset nor the articles of the systematic search could be retrieved, because the hosts that serve them (PubMed Central, NCBI, ScienceDirect, doi.org, Crossref, Europe PMC, Mendeley Data, Zenodo, Figshare and the institutional repository) were not reachable from the computational environment. No values were transcribed from memory, estimated or digitised from figures.</w:t>
       </w:r>
     </w:p>
     <w:p>
@@ -23935,7 +25278,7 @@
         <w:t xml:space="preserve">1.	</w:t>
       </w:r>
       <w:r>
-        <w:t xml:space="preserve">Extract the Ramirez et al. data as a Class C benchmark of the workflow.</w:t>
+        <w:t xml:space="preserve">Extract the Ramirez et al. data (isotherm and kinetic series with pH, C₀, dose, volume, temperature and contact time) and run the full workflow as a Class C benchmark.</w:t>
       </w:r>
     </w:p>
     <w:p>
@@ -23950,7 +25293,18 @@
         <w:t xml:space="preserve">2.	</w:t>
       </w:r>
       <w:r>
-        <w:t xml:space="preserve">Carry out the registered search and extraction, identifying the subset of studies with total-Cr and XPS/XANES evidence.</w:t>
+        <w:t xml:space="preserve">Extract at least 20 further Cr(VI)–carbon studies by the registered protocol (</w:t>
+      </w:r>
+      <w:r>
+        <w:rPr>
+          <w:rFonts w:ascii="Courier New" w:cs="Courier New" w:eastAsia="Courier New" w:hAnsi="Courier New"/>
+          <w:sz w:val="20"/>
+          <w:szCs w:val="20"/>
+        </w:rPr>
+        <w:t xml:space="preserve">data/PROTOCOL.md</w:t>
+      </w:r>
+      <w:r>
+        <w:t xml:space="preserve">), reconstructing pH (initial and final), C₀, dose, solution volume, temperature, contact time, background electrolyte and ionic strength.</w:t>
       </w:r>
     </w:p>
     <w:p>
@@ -23965,7 +25319,37 @@
         <w:t xml:space="preserve">3.	</w:t>
       </w:r>
       <w:r>
-        <w:t xml:space="preserve">Apply the identifiability and validation analyses of §3.3–3.6 to the real corpus, keeping the evidence classes separate.</w:t>
+        <w:t xml:space="preserve">Classify every observation (C, B, A1, A2), identifying the studies that report total Cr and those with XPS or XANES evidence.</w:t>
+      </w:r>
+    </w:p>
+    <w:p>
+      <w:pPr>
+        <w:tabs>
+          <w:tab w:val="left" w:pos="567"/>
+        </w:tabs>
+        <w:spacing w:line="480" w:lineRule="auto"/>
+        <w:ind w:left="567" w:hanging="567"/>
+      </w:pPr>
+      <w:r>
+        <w:t xml:space="preserve">4.	</w:t>
+      </w:r>
+      <w:r>
+        <w:t xml:space="preserve">Apply the equivalence and identifiability tests (§3.3), the LOSO/LOFO validation (§3.4) and the study-level intervals (§3.5) to the real corpus, keeping evidence classes separate.</w:t>
+      </w:r>
+    </w:p>
+    <w:p>
+      <w:pPr>
+        <w:tabs>
+          <w:tab w:val="left" w:pos="567"/>
+        </w:tabs>
+        <w:spacing w:line="480" w:lineRule="auto"/>
+        <w:ind w:left="567" w:hanging="567"/>
+      </w:pPr>
+      <w:r>
+        <w:t xml:space="preserve">5.	</w:t>
+      </w:r>
+      <w:r>
+        <w:t xml:space="preserve">Report empirical findings in a section separate from the synthetic benchmark.</w:t>
       </w:r>
     </w:p>
     <w:p>
@@ -24944,7 +26328,7 @@
         <w:t xml:space="preserve">No empirical validation.</w:t>
       </w:r>
       <w:r>
-        <w:t xml:space="preserve"> All findings in §3.2–3.7 come from simulations. The extraction of the seed dataset (Ramirez et al., 2020) and of 20–30 further studies was not carried out, because the publisher and repository hosts were not reachable from the computational environment (§3.8). This is the main limitation of the paper, and the reviewer's requirement of an empirical application remains unmet in this revision.</w:t>
+        <w:t xml:space="preserve"> All findings in §3.2–3.7 come from simulations. The extraction of the seed dataset (Ramirez et al., 2020) and of 20–30 further studies was not carried out, because the publisher and repository hosts were not reachable from the computational environment (§3.8). This is the main limitation of the paper: the empirical application is still outstanding.</w:t>
       </w:r>
     </w:p>
     <w:p>
@@ -24988,7 +26372,7 @@
         <w:t xml:space="preserve">Thermodynamic validation.</w:t>
       </w:r>
       <w:r>
-        <w:t xml:space="preserve"> Three USGS databases were compared. An independent validation against critically evaluated constants (Ball and Nordstrom, 1998; Rai et al., 1987) is outstanding: those constants could not be retrieved and verified in this revision. NaCl, NaNO₃ and Na₂SO₄ backgrounds were compared (§3.1); Ca²⁺, Mg²⁺, carbonate and dissolved organic matter were not.</w:t>
+        <w:t xml:space="preserve"> Three USGS databases were compared. An independent validation against critically evaluated constants (Ball and Nordstrom, 1998; Rai et al., 1987) is outstanding: those constants could not be retrieved and verified from the computational environment. NaCl, NaNO₃ and Na₂SO₄ backgrounds were compared (§3.1); Ca²⁺, Mg²⁺, carbonate and dissolved organic matter were not.</w:t>
       </w:r>
     </w:p>
     <w:p>
@@ -25372,7 +26756,7 @@
         <w:t xml:space="preserve">karthice1/adsorption</w:t>
       </w:r>
       <w:r>
-        <w:t xml:space="preserve"> (CASSIA 0.3.0).</w:t>
+        <w:t xml:space="preserve"> (CASSIA 0.3.1).</w:t>
       </w:r>
     </w:p>
     <w:p>
@@ -25432,7 +26816,7 @@
           <w:sz w:val="20"/>
           <w:szCs w:val="20"/>
         </w:rPr>
-        <w:t xml:space="preserve">9d5a37bd6012b6abf2cacbca284a97aada468f68</w:t>
+        <w:t xml:space="preserve">0528c60cc3dcd567b246e9e883f41b5ef20de0ef</w:t>
       </w:r>
       <w:r>
         <w:t xml:space="preserve">;</w:t>
@@ -25538,10 +26922,10 @@
           <w:sz w:val="20"/>
           <w:szCs w:val="20"/>
         </w:rPr>
-        <w:t xml:space="preserve">cassia-v0.3.0</w:t>
-      </w:r>
-      <w:r>
-        <w:t xml:space="preserve">) of this commit, archived in Zenodo, will provide the permanent DOI. The tag and archive are created by the author at submission of the revision, because they could not be created from the computational environment; the commit hash and manifest above identify the content unambiguously in the meantime.</w:t>
+        <w:t xml:space="preserve">cassia-v0.3.1</w:t>
+      </w:r>
+      <w:r>
+        <w:t xml:space="preserve">) of this commit, archived in Zenodo, will provide the permanent DOI. The tag and archive are created by the author at submission, because they could not be created from the computational environment; the commit hash and manifest above identify the content unambiguously in the meantime.</w:t>
       </w:r>
     </w:p>
     <w:p>
@@ -25603,7 +26987,7 @@
         <w:t xml:space="preserve">Software versions.</w:t>
       </w:r>
       <w:r>
-        <w:t xml:space="preserve"> CASSIA 0.3.0; phreeqpython 1.6.2 (Vitens); PHREEQC databases minteq.v4.dat, minteq.dat and llnl.dat (revisions in Table S2); adsorption 0.1.0 (Amvro23); pyGAPS 4.3.1.dev693; NumPy 2.5.3; SciPy 1.18.1; pandas 3.0.5; scikit-learn 1.9.1; XGBoost 3.4.1; matplotlib 3.11.2; Python 3.13.17.</w:t>
+        <w:t xml:space="preserve"> CASSIA 0.3.1; phreeqpython 1.6.2 (Vitens); PHREEQC databases minteq.v4.dat, minteq.dat and llnl.dat (revisions in Table S2); adsorption 0.1.0 (Amvro23); pyGAPS 4.3.1.dev693; NumPy 2.5.3; SciPy 1.18.1; pandas 3.0.5; scikit-learn 1.9.1; XGBoost 3.4.1; matplotlib 3.11.2; Python 3.13.17.</w:t>
       </w:r>
     </w:p>
     <w:p>
@@ -26459,7 +27843,7 @@
         <w:t xml:space="preserve">M2 (CV+) has no proven guarantee.</w:t>
       </w:r>
       <w:r>
-        <w:t xml:space="preserve"> M2 uses the same study scores, but with K-fold models instead of a single split, as in the CV+ construction (Barber et al., 2021). The CV+ guarantee is proven for scalar residual scores of exchangeable data points. We have not shown that it extends to within-study quantile scores, so the v0.2 statement of a 1−2α guarantee for M2 is withdrawn. M2 is reported as an empirical method only.</w:t>
+        <w:t xml:space="preserve"> M2 uses the same study scores, but with K-fold models instead of a single split, as in the CV+ construction (Barber et al., 2021). The CV+ guarantee is proven for scalar residual scores of exchangeable data points. We have not shown that it extends to within-study quantile scores, so no 1−2α guarantee is claimed for M2. M2 is reported as an empirical method only.</w:t>
       </w:r>
     </w:p>
     <w:p>
@@ -26980,7 +28364,7 @@
         <w:t xml:space="preserve">ν</w:t>
       </w:r>
       <w:r>
-        <w:t xml:space="preserve">. The nominal test therefore over-rejects: 3–13% at nominal 5% in v0.2.</w:t>
+        <w:t xml:space="preserve">. The nominal test therefore over-rejects (6.7–15% at nominal 5%; §3.3).</w:t>
       </w:r>
     </w:p>
     <w:p>

</xml_diff>